<commit_message>
Add KSK II template update and supplemental material PDF
</commit_message>
<xml_diff>
--- a/data/Themenlisten-Vorlagen/Themenliste_Kaufmännische Steuerung und Kontrolle II.docx
+++ b/data/Themenlisten-Vorlagen/Themenliste_Kaufmännische Steuerung und Kontrolle II.docx
@@ -2,6 +2,507 @@
 <file path=word/document.xml><?xml version="1.0" encoding="utf-8"?>
 <w:document xmlns:wpc="http://schemas.microsoft.com/office/word/2010/wordprocessingCanvas" xmlns:cx="http://schemas.microsoft.com/office/drawing/2014/chartex" xmlns:cx1="http://schemas.microsoft.com/office/drawing/2015/9/8/chartex" xmlns:cx2="http://schemas.microsoft.com/office/drawing/2015/10/21/chartex" xmlns:cx3="http://schemas.microsoft.com/office/drawing/2016/5/9/chartex" xmlns:cx4="http://schemas.microsoft.com/office/drawing/2016/5/10/chartex" xmlns:cx5="http://schemas.microsoft.com/office/drawing/2016/5/11/chartex" xmlns:cx6="http://schemas.microsoft.com/office/drawing/2016/5/12/chartex" xmlns:cx7="http://schemas.microsoft.com/office/drawing/2016/5/13/chartex" xmlns:cx8="http://schemas.microsoft.com/office/drawing/2016/5/14/chartex" xmlns:mc="http://schemas.openxmlformats.org/markup-compatibility/2006" xmlns:aink="http://schemas.microsoft.com/office/drawing/2016/ink" xmlns:am3d="http://schemas.microsoft.com/office/drawing/2017/model3d" xmlns:o="urn:schemas-microsoft-com:office:office" xmlns:oel="http://schemas.microsoft.com/office/2019/extlst" xmlns:r="http://schemas.openxmlformats.org/officeDocument/2006/relationships" xmlns:m="http://schemas.openxmlformats.org/officeDocument/2006/math" xmlns:v="urn:schemas-microsoft-com:vml" xmlns:wp14="http://schemas.microsoft.com/office/word/2010/wordprocessingDrawing" xmlns:wp="http://schemas.openxmlformats.org/drawingml/2006/wordprocessingDrawing" xmlns:w10="urn:schemas-microsoft-com:office:word" xmlns:w="http://schemas.openxmlformats.org/wordprocessingml/2006/main" xmlns:w14="http://schemas.microsoft.com/office/word/2010/wordml" xmlns:w15="http://schemas.microsoft.com/office/word/2012/wordml" xmlns:w16cex="http://schemas.microsoft.com/office/word/2018/wordml/cex" xmlns:w16cid="http://schemas.microsoft.com/office/word/2016/wordml/cid" xmlns:w16="http://schemas.microsoft.com/office/word/2018/wordml" xmlns:w16du="http://schemas.microsoft.com/office/word/2023/wordml/word16du" xmlns:w16sdtdh="http://schemas.microsoft.com/office/word/2020/wordml/sdtdatahash" xmlns:w16sdtfl="http://schemas.microsoft.com/office/word/2024/wordml/sdtformatlock" xmlns:w16se="http://schemas.microsoft.com/office/word/2015/wordml/symex" xmlns:wpg="http://schemas.microsoft.com/office/word/2010/wordprocessingGroup" xmlns:wpi="http://schemas.microsoft.com/office/word/2010/wordprocessingInk" xmlns:wne="http://schemas.microsoft.com/office/word/2006/wordml" xmlns:wps="http://schemas.microsoft.com/office/word/2010/wordprocessingShape" mc:Ignorable="w14 w15 w16se w16cid w16 w16cex w16sdtdh w16sdtfl w16du wp14">
   <w:body>
+    <w:p>
+      <w:pPr>
+        <w:rPr>
+          <w:rFonts w:ascii="Aptos Narrow" w:hAnsi="Aptos Narrow"/>
+          <w:b/>
+        </w:rPr>
+      </w:pPr>
+    </w:p>
+    <w:p>
+      <w:pPr>
+        <w:rPr>
+          <w:rFonts w:ascii="Aptos Narrow" w:hAnsi="Aptos Narrow"/>
+          <w:b/>
+        </w:rPr>
+      </w:pPr>
+    </w:p>
+    <w:p>
+      <w:pPr>
+        <w:rPr>
+          <w:rFonts w:ascii="Aptos Narrow" w:hAnsi="Aptos Narrow"/>
+          <w:b/>
+        </w:rPr>
+      </w:pPr>
+    </w:p>
+    <w:p>
+      <w:pPr>
+        <w:rPr>
+          <w:rFonts w:ascii="Aptos Narrow" w:hAnsi="Aptos Narrow"/>
+          <w:b/>
+        </w:rPr>
+      </w:pPr>
+    </w:p>
+    <w:p>
+      <w:pPr>
+        <w:rPr>
+          <w:rFonts w:ascii="Aptos Narrow" w:hAnsi="Aptos Narrow"/>
+          <w:b/>
+        </w:rPr>
+      </w:pPr>
+    </w:p>
+    <w:p>
+      <w:pPr>
+        <w:rPr>
+          <w:rFonts w:ascii="Aptos Narrow" w:hAnsi="Aptos Narrow"/>
+          <w:b/>
+        </w:rPr>
+      </w:pPr>
+    </w:p>
+    <w:p>
+      <w:pPr>
+        <w:rPr>
+          <w:rFonts w:ascii="Aptos Narrow" w:hAnsi="Aptos Narrow"/>
+          <w:b/>
+        </w:rPr>
+      </w:pPr>
+    </w:p>
+    <w:p>
+      <w:pPr>
+        <w:rPr>
+          <w:rFonts w:ascii="Aptos Narrow" w:hAnsi="Aptos Narrow"/>
+          <w:b/>
+        </w:rPr>
+      </w:pPr>
+    </w:p>
+    <w:p>
+      <w:pPr>
+        <w:rPr>
+          <w:rFonts w:ascii="Aptos Narrow" w:hAnsi="Aptos Narrow"/>
+          <w:b/>
+        </w:rPr>
+      </w:pPr>
+      <w:r>
+        <w:rPr>
+          <w:rFonts w:ascii="Aptos Narrow" w:hAnsi="Aptos Narrow"/>
+          <w:b/>
+        </w:rPr>
+        <w:t>Hinweise zur Themenliste des Lernbereiches &lt;&lt;</w:t>
+      </w:r>
+      <w:proofErr w:type="spellStart"/>
+      <w:r>
+        <w:rPr>
+          <w:rFonts w:ascii="Aptos Narrow" w:hAnsi="Aptos Narrow"/>
+          <w:b/>
+        </w:rPr>
+        <w:t>lernbereich</w:t>
+      </w:r>
+      <w:proofErr w:type="spellEnd"/>
+      <w:r>
+        <w:rPr>
+          <w:rFonts w:ascii="Aptos Narrow" w:hAnsi="Aptos Narrow"/>
+          <w:b/>
+        </w:rPr>
+        <w:t>&gt;&gt;</w:t>
+      </w:r>
+    </w:p>
+    <w:p>
+      <w:pPr>
+        <w:rPr>
+          <w:rFonts w:ascii="Aptos Narrow" w:hAnsi="Aptos Narrow"/>
+          <w:bCs/>
+        </w:rPr>
+      </w:pPr>
+    </w:p>
+    <w:p>
+      <w:pPr>
+        <w:rPr>
+          <w:rFonts w:ascii="Aptos Narrow" w:hAnsi="Aptos Narrow"/>
+          <w:bCs/>
+          <w:sz w:val="20"/>
+          <w:szCs w:val="20"/>
+        </w:rPr>
+      </w:pPr>
+      <w:r>
+        <w:rPr>
+          <w:rFonts w:ascii="Aptos Narrow" w:hAnsi="Aptos Narrow"/>
+          <w:bCs/>
+          <w:sz w:val="20"/>
+          <w:szCs w:val="20"/>
+        </w:rPr>
+        <w:t>Die für die Bearbeitung der Lernaufträge notwendigen Informationen entnehmen Sie den jeweiligen Situationsbeschreibungen sowie insbesondere den entsprechenden Kapiteln in den Fachbüchern. Lesen Sie letztgenannte einmal durch, bevor Sie sich an die Bearbeitung der Lernaufträge setzen.</w:t>
+      </w:r>
+      <w:r>
+        <w:rPr>
+          <w:rFonts w:ascii="Aptos Narrow" w:hAnsi="Aptos Narrow"/>
+          <w:bCs/>
+          <w:sz w:val="20"/>
+          <w:szCs w:val="20"/>
+        </w:rPr>
+        <w:t xml:space="preserve"> Bitte lesen Sie auch das ‚Kleingedruckte‘ Ihrer Themenliste.</w:t>
+      </w:r>
+    </w:p>
+    <w:p>
+      <w:pPr>
+        <w:rPr>
+          <w:rFonts w:ascii="Aptos Narrow" w:hAnsi="Aptos Narrow"/>
+          <w:bCs/>
+          <w:sz w:val="20"/>
+          <w:szCs w:val="20"/>
+        </w:rPr>
+      </w:pPr>
+    </w:p>
+    <w:p>
+      <w:pPr>
+        <w:rPr>
+          <w:rFonts w:ascii="Aptos Narrow" w:hAnsi="Aptos Narrow"/>
+          <w:bCs/>
+          <w:sz w:val="20"/>
+          <w:szCs w:val="20"/>
+        </w:rPr>
+      </w:pPr>
+      <w:r>
+        <w:rPr>
+          <w:rFonts w:ascii="Aptos Narrow" w:hAnsi="Aptos Narrow"/>
+          <w:bCs/>
+          <w:sz w:val="20"/>
+          <w:szCs w:val="20"/>
+        </w:rPr>
+        <w:t xml:space="preserve">Bitte beachten Sie, dass Sie mehrere Ausarbeitungen für Lernsituationen in einer Datei zusammenfassen können und vergeben Sie für die Einsendung an Ihre Ausbilder folgenden Dateinamen: </w:t>
+      </w:r>
+      <w:r>
+        <w:rPr>
+          <w:rFonts w:ascii="Aptos Narrow" w:hAnsi="Aptos Narrow"/>
+          <w:bCs/>
+          <w:sz w:val="20"/>
+          <w:szCs w:val="20"/>
+        </w:rPr>
+        <w:br/>
+      </w:r>
+      <w:r>
+        <w:rPr>
+          <w:rFonts w:ascii="Aptos Narrow" w:hAnsi="Aptos Narrow"/>
+          <w:bCs/>
+          <w:sz w:val="20"/>
+          <w:szCs w:val="20"/>
+        </w:rPr>
+        <w:t xml:space="preserve">„LS </w:t>
+      </w:r>
+      <w:proofErr w:type="spellStart"/>
+      <w:r>
+        <w:rPr>
+          <w:rFonts w:ascii="Aptos Narrow" w:hAnsi="Aptos Narrow"/>
+          <w:bCs/>
+          <w:sz w:val="20"/>
+          <w:szCs w:val="20"/>
+        </w:rPr>
+        <w:t>X.X_Nachname</w:t>
+      </w:r>
+      <w:proofErr w:type="spellEnd"/>
+      <w:r>
+        <w:rPr>
+          <w:rFonts w:ascii="Aptos Narrow" w:hAnsi="Aptos Narrow"/>
+          <w:bCs/>
+          <w:sz w:val="20"/>
+          <w:szCs w:val="20"/>
+        </w:rPr>
+        <w:t>“.</w:t>
+      </w:r>
+    </w:p>
+    <w:p>
+      <w:pPr>
+        <w:rPr>
+          <w:rFonts w:ascii="Aptos Narrow" w:hAnsi="Aptos Narrow"/>
+          <w:bCs/>
+          <w:sz w:val="20"/>
+          <w:szCs w:val="20"/>
+        </w:rPr>
+      </w:pPr>
+    </w:p>
+    <w:p>
+      <w:pPr>
+        <w:rPr>
+          <w:rFonts w:ascii="Aptos Narrow" w:hAnsi="Aptos Narrow"/>
+          <w:bCs/>
+          <w:sz w:val="20"/>
+          <w:szCs w:val="20"/>
+        </w:rPr>
+      </w:pPr>
+      <w:r>
+        <w:rPr>
+          <w:rFonts w:ascii="Aptos Narrow" w:hAnsi="Aptos Narrow"/>
+          <w:bCs/>
+          <w:sz w:val="20"/>
+          <w:szCs w:val="20"/>
+        </w:rPr>
+        <w:t xml:space="preserve">Bitte senden Sie diese Themenliste zum Ende des Lernbereiches eingescannt per </w:t>
+      </w:r>
+      <w:r>
+        <w:rPr>
+          <w:rFonts w:ascii="Aptos Narrow" w:hAnsi="Aptos Narrow"/>
+          <w:bCs/>
+          <w:sz w:val="20"/>
+          <w:szCs w:val="20"/>
+        </w:rPr>
+        <w:t>E-</w:t>
+      </w:r>
+      <w:r>
+        <w:rPr>
+          <w:rFonts w:ascii="Aptos Narrow" w:hAnsi="Aptos Narrow"/>
+          <w:bCs/>
+          <w:sz w:val="20"/>
+          <w:szCs w:val="20"/>
+        </w:rPr>
+        <w:t>Mail an Ihren ABI.</w:t>
+      </w:r>
+    </w:p>
+    <w:p>
+      <w:pPr>
+        <w:rPr>
+          <w:rFonts w:ascii="Aptos Narrow" w:hAnsi="Aptos Narrow"/>
+          <w:bCs/>
+          <w:sz w:val="20"/>
+          <w:szCs w:val="20"/>
+        </w:rPr>
+      </w:pPr>
+    </w:p>
+    <w:p>
+      <w:pPr>
+        <w:rPr>
+          <w:rFonts w:ascii="Aptos Narrow" w:hAnsi="Aptos Narrow"/>
+          <w:bCs/>
+          <w:sz w:val="20"/>
+          <w:szCs w:val="20"/>
+        </w:rPr>
+      </w:pPr>
+    </w:p>
+    <w:p>
+      <w:pPr>
+        <w:spacing w:after="200" w:line="276" w:lineRule="auto"/>
+        <w:rPr>
+          <w:sz w:val="20"/>
+          <w:szCs w:val="20"/>
+        </w:rPr>
+      </w:pPr>
+    </w:p>
+    <w:p>
+      <w:pPr>
+        <w:spacing w:after="200" w:line="276" w:lineRule="auto"/>
+      </w:pPr>
+      <w:r>
+        <w:br w:type="page"/>
+      </w:r>
+    </w:p>
+    <w:tbl>
+      <w:tblPr>
+        <w:tblStyle w:val="Tabellenraster"/>
+        <w:tblW w:w="5011" w:type="pct"/>
+        <w:tblLayout w:type="fixed"/>
+        <w:tblCellMar>
+          <w:top w:w="57" w:type="dxa"/>
+          <w:left w:w="57" w:type="dxa"/>
+          <w:bottom w:w="57" w:type="dxa"/>
+          <w:right w:w="57" w:type="dxa"/>
+        </w:tblCellMar>
+        <w:tblLook w:val="04A0" w:firstRow="1" w:lastRow="0" w:firstColumn="1" w:lastColumn="0" w:noHBand="0" w:noVBand="1"/>
+      </w:tblPr>
+      <w:tblGrid>
+        <w:gridCol w:w="15729"/>
+      </w:tblGrid>
+      <w:tr>
+        <w:trPr>
+          <w:cantSplit/>
+          <w:trHeight w:val="964"/>
+        </w:trPr>
+        <w:tc>
+          <w:tcPr>
+            <w:tcW w:w="15729" w:type="dxa"/>
+            <w:shd w:val="clear" w:color="auto" w:fill="F2F2F2" w:themeFill="background1" w:themeFillShade="F2"/>
+          </w:tcPr>
+          <w:p>
+            <w:pPr>
+              <w:spacing w:after="120"/>
+              <w:rPr>
+                <w:rFonts w:ascii="Aptos Narrow" w:hAnsi="Aptos Narrow"/>
+                <w:b/>
+                <w:color w:val="262626" w:themeColor="text1" w:themeTint="D9"/>
+              </w:rPr>
+            </w:pPr>
+            <w:r>
+              <w:rPr>
+                <w:rFonts w:ascii="Aptos Narrow" w:hAnsi="Aptos Narrow"/>
+                <w:b/>
+                <w:color w:val="262626" w:themeColor="text1" w:themeTint="D9"/>
+              </w:rPr>
+              <w:lastRenderedPageBreak/>
+              <w:t>Abgrenzungs</w:t>
+            </w:r>
+            <w:r>
+              <w:rPr>
+                <w:rFonts w:ascii="Aptos Narrow" w:hAnsi="Aptos Narrow"/>
+                <w:b/>
+                <w:color w:val="262626" w:themeColor="text1" w:themeTint="D9"/>
+              </w:rPr>
+              <w:t>rechnung</w:t>
+            </w:r>
+          </w:p>
+          <w:p>
+            <w:pPr>
+              <w:autoSpaceDE w:val="0"/>
+              <w:autoSpaceDN w:val="0"/>
+              <w:adjustRightInd w:val="0"/>
+              <w:spacing w:line="240" w:lineRule="auto"/>
+              <w:rPr>
+                <w:rFonts w:ascii="Aptos Narrow" w:eastAsia="MS Gothic" w:hAnsi="Aptos Narrow"/>
+                <w:color w:val="262626" w:themeColor="text1" w:themeTint="D9"/>
+                <w:sz w:val="20"/>
+                <w:szCs w:val="20"/>
+              </w:rPr>
+            </w:pPr>
+            <w:r>
+              <w:rPr>
+                <w:rFonts w:ascii="Aptos Narrow" w:hAnsi="Aptos Narrow"/>
+                <w:color w:val="262626" w:themeColor="text1" w:themeTint="D9"/>
+                <w:sz w:val="20"/>
+                <w:szCs w:val="20"/>
+              </w:rPr>
+              <w:t>Bevor man mit der eigentlichen Kostenrechnung beginnt, braucht man die sogenannte Abgrenzungsrechnung. Sie hilft dabei zu unterscheiden, welche Werte wirklich zum Betrieb gehören und welche zum gesamten Unternehmen.</w:t>
+            </w:r>
+          </w:p>
+        </w:tc>
+      </w:tr>
+    </w:tbl>
+    <w:p/>
+    <w:tbl>
+      <w:tblPr>
+        <w:tblStyle w:val="Tabellenraster"/>
+        <w:tblW w:w="5011" w:type="pct"/>
+        <w:tblLayout w:type="fixed"/>
+        <w:tblCellMar>
+          <w:top w:w="57" w:type="dxa"/>
+          <w:left w:w="57" w:type="dxa"/>
+          <w:bottom w:w="57" w:type="dxa"/>
+          <w:right w:w="57" w:type="dxa"/>
+        </w:tblCellMar>
+        <w:tblLook w:val="04A0" w:firstRow="1" w:lastRow="0" w:firstColumn="1" w:lastColumn="0" w:noHBand="0" w:noVBand="1"/>
+      </w:tblPr>
+      <w:tblGrid>
+        <w:gridCol w:w="15729"/>
+      </w:tblGrid>
+      <w:tr>
+        <w:trPr>
+          <w:cantSplit/>
+          <w:trHeight w:val="964"/>
+        </w:trPr>
+        <w:tc>
+          <w:tcPr>
+            <w:tcW w:w="15729" w:type="dxa"/>
+            <w:shd w:val="clear" w:color="auto" w:fill="F2F2F2" w:themeFill="background1" w:themeFillShade="F2"/>
+          </w:tcPr>
+          <w:p>
+            <w:pPr>
+              <w:spacing w:after="120"/>
+              <w:rPr>
+                <w:rFonts w:ascii="Aptos Narrow" w:hAnsi="Aptos Narrow"/>
+                <w:b/>
+                <w:color w:val="262626" w:themeColor="text1" w:themeTint="D9"/>
+              </w:rPr>
+            </w:pPr>
+            <w:r>
+              <w:rPr>
+                <w:rFonts w:ascii="Aptos Narrow" w:hAnsi="Aptos Narrow"/>
+                <w:b/>
+                <w:color w:val="262626" w:themeColor="text1" w:themeTint="D9"/>
+              </w:rPr>
+              <w:t>Vollkostenrechnung</w:t>
+            </w:r>
+          </w:p>
+          <w:p>
+            <w:pPr>
+              <w:rPr>
+                <w:rFonts w:ascii="Aptos Narrow" w:eastAsia="MS Gothic" w:hAnsi="Aptos Narrow"/>
+                <w:color w:val="262626" w:themeColor="text1" w:themeTint="D9"/>
+                <w:sz w:val="20"/>
+                <w:szCs w:val="20"/>
+              </w:rPr>
+            </w:pPr>
+            <w:r>
+              <w:rPr>
+                <w:rFonts w:ascii="Aptos Narrow" w:eastAsia="MS Gothic" w:hAnsi="Aptos Narrow"/>
+                <w:color w:val="262626" w:themeColor="text1" w:themeTint="D9"/>
+                <w:sz w:val="20"/>
+                <w:szCs w:val="20"/>
+              </w:rPr>
+              <w:t>Bei der Vollkostenrechnung werden alle Kosten einer Periode vollständig erfasst. Zuerst sortiert man sie nach Kostenarten (z.</w:t>
+            </w:r>
+            <w:r>
+              <w:rPr>
+                <w:rFonts w:ascii="Arial" w:eastAsia="MS Gothic" w:hAnsi="Arial" w:cs="Arial"/>
+                <w:color w:val="262626" w:themeColor="text1" w:themeTint="D9"/>
+                <w:sz w:val="20"/>
+                <w:szCs w:val="20"/>
+              </w:rPr>
+              <w:t> </w:t>
+            </w:r>
+            <w:r>
+              <w:rPr>
+                <w:rFonts w:ascii="Aptos Narrow" w:eastAsia="MS Gothic" w:hAnsi="Aptos Narrow"/>
+                <w:color w:val="262626" w:themeColor="text1" w:themeTint="D9"/>
+                <w:sz w:val="20"/>
+                <w:szCs w:val="20"/>
+              </w:rPr>
+              <w:t>B. Material, L</w:t>
+            </w:r>
+            <w:r>
+              <w:rPr>
+                <w:rFonts w:ascii="Aptos Narrow" w:eastAsia="MS Gothic" w:hAnsi="Aptos Narrow" w:cs="Aptos Narrow"/>
+                <w:color w:val="262626" w:themeColor="text1" w:themeTint="D9"/>
+                <w:sz w:val="20"/>
+                <w:szCs w:val="20"/>
+              </w:rPr>
+              <w:t>ö</w:t>
+            </w:r>
+            <w:r>
+              <w:rPr>
+                <w:rFonts w:ascii="Aptos Narrow" w:eastAsia="MS Gothic" w:hAnsi="Aptos Narrow"/>
+                <w:color w:val="262626" w:themeColor="text1" w:themeTint="D9"/>
+                <w:sz w:val="20"/>
+                <w:szCs w:val="20"/>
+              </w:rPr>
+              <w:t>hne, Miete). Dann verteilt man sie auf die Kostenstellen, also die Bereiche, in denen sie entstehen. Am Ende werden die gesamten Kosten den Kostentr</w:t>
+            </w:r>
+            <w:r>
+              <w:rPr>
+                <w:rFonts w:ascii="Aptos Narrow" w:eastAsia="MS Gothic" w:hAnsi="Aptos Narrow" w:cs="Aptos Narrow"/>
+                <w:color w:val="262626" w:themeColor="text1" w:themeTint="D9"/>
+                <w:sz w:val="20"/>
+                <w:szCs w:val="20"/>
+              </w:rPr>
+              <w:t>ä</w:t>
+            </w:r>
+            <w:r>
+              <w:rPr>
+                <w:rFonts w:ascii="Aptos Narrow" w:eastAsia="MS Gothic" w:hAnsi="Aptos Narrow"/>
+                <w:color w:val="262626" w:themeColor="text1" w:themeTint="D9"/>
+                <w:sz w:val="20"/>
+                <w:szCs w:val="20"/>
+              </w:rPr>
+              <w:t xml:space="preserve">gern zugeordnet </w:t>
+            </w:r>
+            <w:r>
+              <w:rPr>
+                <w:rFonts w:ascii="Aptos Narrow" w:eastAsia="MS Gothic" w:hAnsi="Aptos Narrow" w:cs="Aptos Narrow"/>
+                <w:color w:val="262626" w:themeColor="text1" w:themeTint="D9"/>
+                <w:sz w:val="20"/>
+                <w:szCs w:val="20"/>
+              </w:rPr>
+              <w:t>–</w:t>
+            </w:r>
+            <w:r>
+              <w:rPr>
+                <w:rFonts w:ascii="Aptos Narrow" w:eastAsia="MS Gothic" w:hAnsi="Aptos Narrow"/>
+                <w:color w:val="262626" w:themeColor="text1" w:themeTint="D9"/>
+                <w:sz w:val="20"/>
+                <w:szCs w:val="20"/>
+              </w:rPr>
+              <w:t xml:space="preserve"> also den Produkten oder Dienstleistungen, die das Unternehmen herstellt.</w:t>
+            </w:r>
+          </w:p>
+        </w:tc>
+      </w:tr>
+    </w:tbl>
+    <w:p/>
     <w:tbl>
       <w:tblPr>
         <w:tblStyle w:val="Tabellenraster"/>
@@ -301,7 +802,7 @@
                 <w:sz w:val="18"/>
                 <w:szCs w:val="18"/>
               </w:rPr>
-              <w:t>6</w:t>
+              <w:t>10</w:t>
             </w:r>
           </w:p>
         </w:tc>
@@ -318,12 +819,42 @@
           </w:tcPr>
           <w:p>
             <w:pPr>
-              <w:rPr>
-                <w:rFonts w:ascii="Aptos Narrow" w:hAnsi="Aptos Narrow"/>
-                <w:b/>
-                <w:color w:val="244061" w:themeColor="accent1" w:themeShade="80"/>
-              </w:rPr>
-            </w:pPr>
+              <w:spacing w:after="120"/>
+              <w:rPr>
+                <w:rFonts w:ascii="Aptos Narrow" w:hAnsi="Aptos Narrow"/>
+                <w:b/>
+                <w:color w:val="244061" w:themeColor="accent1" w:themeShade="80"/>
+              </w:rPr>
+            </w:pPr>
+            <w:r>
+              <w:rPr>
+                <w:rFonts w:ascii="Aptos Narrow" w:hAnsi="Aptos Narrow"/>
+                <w:b/>
+                <w:color w:val="244061" w:themeColor="accent1" w:themeShade="80"/>
+              </w:rPr>
+              <w:t>Ergebnistabelle erstellen</w:t>
+            </w:r>
+          </w:p>
+          <w:p>
+            <w:pPr>
+              <w:rPr>
+                <w:rFonts w:ascii="Aptos Narrow" w:hAnsi="Aptos Narrow"/>
+                <w:bCs/>
+                <w:color w:val="244061" w:themeColor="accent1" w:themeShade="80"/>
+                <w:sz w:val="20"/>
+                <w:szCs w:val="20"/>
+              </w:rPr>
+            </w:pPr>
+            <w:r>
+              <w:rPr>
+                <w:rFonts w:ascii="Aptos Narrow" w:hAnsi="Aptos Narrow"/>
+                <w:bCs/>
+                <w:color w:val="244061" w:themeColor="accent1" w:themeShade="80"/>
+                <w:sz w:val="20"/>
+                <w:szCs w:val="20"/>
+              </w:rPr>
+              <w:t>Abgrenzungsrechnung</w:t>
+            </w:r>
           </w:p>
         </w:tc>
         <w:tc>
@@ -336,11 +867,169 @@
                 <w:tab w:val="left" w:pos="989"/>
                 <w:tab w:val="right" w:pos="4533"/>
               </w:tabs>
-              <w:rPr>
-                <w:rFonts w:ascii="Aptos Narrow" w:hAnsi="Aptos Narrow"/>
-                <w:color w:val="215868" w:themeColor="accent5" w:themeShade="80"/>
-              </w:rPr>
-            </w:pPr>
+              <w:spacing w:after="120"/>
+              <w:rPr>
+                <w:rFonts w:ascii="Aptos Narrow" w:hAnsi="Aptos Narrow"/>
+                <w:b/>
+                <w:bCs/>
+                <w:color w:val="215868" w:themeColor="accent5" w:themeShade="80"/>
+              </w:rPr>
+            </w:pPr>
+            <w:r>
+              <w:rPr>
+                <w:rFonts w:ascii="Aptos Narrow" w:hAnsi="Aptos Narrow"/>
+                <w:b/>
+                <w:bCs/>
+                <w:color w:val="215868" w:themeColor="accent5" w:themeShade="80"/>
+              </w:rPr>
+              <w:t>Lernsituation 10.1</w:t>
+            </w:r>
+          </w:p>
+          <w:p>
+            <w:pPr>
+              <w:pStyle w:val="Listenabsatz"/>
+              <w:numPr>
+                <w:ilvl w:val="0"/>
+                <w:numId w:val="1"/>
+              </w:numPr>
+              <w:tabs>
+                <w:tab w:val="left" w:pos="989"/>
+                <w:tab w:val="right" w:pos="4533"/>
+              </w:tabs>
+              <w:rPr>
+                <w:rFonts w:ascii="Aptos Narrow" w:hAnsi="Aptos Narrow"/>
+                <w:color w:val="215868" w:themeColor="accent5" w:themeShade="80"/>
+              </w:rPr>
+            </w:pPr>
+            <w:r>
+              <w:rPr>
+                <w:rFonts w:ascii="Aptos Narrow" w:hAnsi="Aptos Narrow"/>
+                <w:color w:val="215868" w:themeColor="accent5" w:themeShade="80"/>
+              </w:rPr>
+              <w:t xml:space="preserve">Ohne den ersten Aufgabenteil! </w:t>
+            </w:r>
+          </w:p>
+          <w:p>
+            <w:pPr>
+              <w:pStyle w:val="Listenabsatz"/>
+              <w:numPr>
+                <w:ilvl w:val="0"/>
+                <w:numId w:val="1"/>
+              </w:numPr>
+              <w:tabs>
+                <w:tab w:val="left" w:pos="989"/>
+                <w:tab w:val="right" w:pos="4533"/>
+              </w:tabs>
+              <w:rPr>
+                <w:rFonts w:ascii="Aptos Narrow" w:hAnsi="Aptos Narrow"/>
+                <w:color w:val="215868" w:themeColor="accent5" w:themeShade="80"/>
+              </w:rPr>
+            </w:pPr>
+            <w:r>
+              <w:rPr>
+                <w:rFonts w:ascii="Aptos Narrow" w:hAnsi="Aptos Narrow"/>
+                <w:color w:val="215868" w:themeColor="accent5" w:themeShade="80"/>
+              </w:rPr>
+              <w:t xml:space="preserve">Im zweiten Aufgabenteil ohne Arbeitsauftrag 7b </w:t>
+            </w:r>
+          </w:p>
+          <w:p>
+            <w:pPr>
+              <w:pStyle w:val="Listenabsatz"/>
+              <w:numPr>
+                <w:ilvl w:val="0"/>
+                <w:numId w:val="1"/>
+              </w:numPr>
+              <w:tabs>
+                <w:tab w:val="left" w:pos="989"/>
+                <w:tab w:val="right" w:pos="4533"/>
+              </w:tabs>
+              <w:rPr>
+                <w:rFonts w:ascii="Aptos Narrow" w:hAnsi="Aptos Narrow"/>
+                <w:color w:val="215868" w:themeColor="accent5" w:themeShade="80"/>
+              </w:rPr>
+            </w:pPr>
+            <w:r>
+              <w:rPr>
+                <w:rFonts w:ascii="Aptos Narrow" w:hAnsi="Aptos Narrow"/>
+                <w:color w:val="215868" w:themeColor="accent5" w:themeShade="80"/>
+              </w:rPr>
+              <w:t>Vertiefende Aufgaben</w:t>
+            </w:r>
+            <w:r>
+              <w:rPr>
+                <w:rFonts w:ascii="Aptos Narrow" w:hAnsi="Aptos Narrow"/>
+                <w:color w:val="215868" w:themeColor="accent5" w:themeShade="80"/>
+              </w:rPr>
+              <w:t xml:space="preserve">, </w:t>
+            </w:r>
+            <w:r>
+              <w:rPr>
+                <w:rFonts w:ascii="Aptos Narrow" w:hAnsi="Aptos Narrow"/>
+                <w:color w:val="215868" w:themeColor="accent5" w:themeShade="80"/>
+              </w:rPr>
+              <w:t>ohne Aufgabe 1</w:t>
+            </w:r>
+          </w:p>
+          <w:p>
+            <w:pPr>
+              <w:tabs>
+                <w:tab w:val="left" w:pos="989"/>
+                <w:tab w:val="right" w:pos="4533"/>
+              </w:tabs>
+              <w:spacing w:before="120"/>
+              <w:rPr>
+                <w:rFonts w:ascii="Aptos Narrow" w:hAnsi="Aptos Narrow"/>
+                <w:color w:val="215868" w:themeColor="accent5" w:themeShade="80"/>
+                <w:sz w:val="20"/>
+                <w:szCs w:val="20"/>
+              </w:rPr>
+            </w:pPr>
+            <w:r>
+              <w:rPr>
+                <w:rFonts w:ascii="Aptos Narrow" w:hAnsi="Aptos Narrow"/>
+                <w:color w:val="215868" w:themeColor="accent5" w:themeShade="80"/>
+                <w:sz w:val="20"/>
+                <w:szCs w:val="20"/>
+              </w:rPr>
+              <w:t>Hinweis zu Aufgabe 14: Bitte achten Sie bei den Hinweisen zur Erfassung der Kosten auf Nr. 5.: Die Rohstoff-Einkäufe wurden gewichtet. Die Gewichtung ergibt in Summe keine 100</w:t>
+            </w:r>
+            <w:r>
+              <w:rPr>
+                <w:rFonts w:ascii="Aptos Narrow" w:hAnsi="Aptos Narrow"/>
+                <w:color w:val="215868" w:themeColor="accent5" w:themeShade="80"/>
+                <w:sz w:val="20"/>
+                <w:szCs w:val="20"/>
+              </w:rPr>
+              <w:t> </w:t>
+            </w:r>
+            <w:r>
+              <w:rPr>
+                <w:rFonts w:ascii="Aptos Narrow" w:hAnsi="Aptos Narrow"/>
+                <w:color w:val="215868" w:themeColor="accent5" w:themeShade="80"/>
+                <w:sz w:val="20"/>
+                <w:szCs w:val="20"/>
+              </w:rPr>
+              <w:t xml:space="preserve">%. Es ist daher mit </w:t>
+            </w:r>
+            <w:r>
+              <w:rPr>
+                <w:rFonts w:ascii="Aptos Narrow" w:hAnsi="Aptos Narrow"/>
+                <w:color w:val="215868" w:themeColor="accent5" w:themeShade="80"/>
+                <w:sz w:val="20"/>
+                <w:szCs w:val="20"/>
+              </w:rPr>
+              <w:t>„Anteilen“,</w:t>
+            </w:r>
+            <w:r>
+              <w:rPr>
+                <w:rFonts w:ascii="Aptos Narrow" w:hAnsi="Aptos Narrow"/>
+                <w:color w:val="215868" w:themeColor="accent5" w:themeShade="80"/>
+                <w:sz w:val="20"/>
+                <w:szCs w:val="20"/>
+              </w:rPr>
+              <w:t xml:space="preserve"> statt Prozent zu rechnen.</w:t>
+            </w:r>
           </w:p>
         </w:tc>
         <w:tc>
@@ -506,12 +1195,91 @@
           </w:tcPr>
           <w:p>
             <w:pPr>
-              <w:rPr>
-                <w:rFonts w:ascii="Aptos Narrow" w:hAnsi="Aptos Narrow"/>
-                <w:b/>
-                <w:color w:val="244061" w:themeColor="accent1" w:themeShade="80"/>
-              </w:rPr>
-            </w:pPr>
+              <w:spacing w:after="120"/>
+              <w:rPr>
+                <w:rFonts w:ascii="Aptos Narrow" w:hAnsi="Aptos Narrow"/>
+                <w:b/>
+                <w:color w:val="244061" w:themeColor="accent1" w:themeShade="80"/>
+              </w:rPr>
+            </w:pPr>
+            <w:r>
+              <w:rPr>
+                <w:rFonts w:ascii="Aptos Narrow" w:hAnsi="Aptos Narrow"/>
+                <w:b/>
+                <w:color w:val="244061" w:themeColor="accent1" w:themeShade="80"/>
+              </w:rPr>
+              <w:lastRenderedPageBreak/>
+              <w:t>Kostenstellenrechnung</w:t>
+            </w:r>
+          </w:p>
+          <w:p>
+            <w:pPr>
+              <w:rPr>
+                <w:rFonts w:ascii="Aptos Narrow" w:hAnsi="Aptos Narrow"/>
+                <w:bCs/>
+                <w:color w:val="244061" w:themeColor="accent1" w:themeShade="80"/>
+                <w:sz w:val="20"/>
+                <w:szCs w:val="20"/>
+              </w:rPr>
+            </w:pPr>
+            <w:r>
+              <w:rPr>
+                <w:rFonts w:ascii="Aptos Narrow" w:hAnsi="Aptos Narrow"/>
+                <w:bCs/>
+                <w:color w:val="244061" w:themeColor="accent1" w:themeShade="80"/>
+                <w:sz w:val="20"/>
+                <w:szCs w:val="20"/>
+              </w:rPr>
+              <w:t>Wo Kosten entstehen, Kosten verteilen und Kosten transparent machen.</w:t>
+            </w:r>
+          </w:p>
+          <w:p>
+            <w:pPr>
+              <w:rPr>
+                <w:rFonts w:ascii="Aptos Narrow" w:hAnsi="Aptos Narrow"/>
+                <w:b/>
+                <w:color w:val="244061" w:themeColor="accent1" w:themeShade="80"/>
+              </w:rPr>
+            </w:pPr>
+          </w:p>
+          <w:p>
+            <w:pPr>
+              <w:spacing w:after="120"/>
+              <w:rPr>
+                <w:rFonts w:ascii="Aptos Narrow" w:hAnsi="Aptos Narrow"/>
+                <w:b/>
+                <w:color w:val="244061" w:themeColor="accent1" w:themeShade="80"/>
+              </w:rPr>
+            </w:pPr>
+            <w:r>
+              <w:rPr>
+                <w:rFonts w:ascii="Aptos Narrow" w:hAnsi="Aptos Narrow"/>
+                <w:b/>
+                <w:color w:val="244061" w:themeColor="accent1" w:themeShade="80"/>
+              </w:rPr>
+              <w:t>Kostenträgerrechnung</w:t>
+            </w:r>
+          </w:p>
+          <w:p>
+            <w:pPr>
+              <w:rPr>
+                <w:rFonts w:ascii="Aptos Narrow" w:hAnsi="Aptos Narrow"/>
+                <w:bCs/>
+                <w:color w:val="244061" w:themeColor="accent1" w:themeShade="80"/>
+                <w:sz w:val="20"/>
+                <w:szCs w:val="20"/>
+              </w:rPr>
+            </w:pPr>
+            <w:r>
+              <w:rPr>
+                <w:rFonts w:ascii="Aptos Narrow" w:hAnsi="Aptos Narrow"/>
+                <w:bCs/>
+                <w:color w:val="244061" w:themeColor="accent1" w:themeShade="80"/>
+                <w:sz w:val="20"/>
+                <w:szCs w:val="20"/>
+              </w:rPr>
+              <w:t>Wofür Kosten entstehen und Ermittlung der Selbstkosten, Deckungsbeitrag je Produkt und Kalkulation von Preisen.</w:t>
+            </w:r>
           </w:p>
         </w:tc>
         <w:tc>
@@ -524,11 +1292,672 @@
                 <w:tab w:val="left" w:pos="989"/>
                 <w:tab w:val="right" w:pos="4533"/>
               </w:tabs>
-              <w:rPr>
-                <w:rFonts w:ascii="Aptos Narrow" w:hAnsi="Aptos Narrow"/>
-                <w:color w:val="215868" w:themeColor="accent5" w:themeShade="80"/>
-              </w:rPr>
-            </w:pPr>
+              <w:spacing w:after="120"/>
+              <w:rPr>
+                <w:rFonts w:ascii="Aptos Narrow" w:hAnsi="Aptos Narrow"/>
+                <w:b/>
+                <w:bCs/>
+                <w:color w:val="215868" w:themeColor="accent5" w:themeShade="80"/>
+              </w:rPr>
+            </w:pPr>
+            <w:r>
+              <w:rPr>
+                <w:rFonts w:ascii="Aptos Narrow" w:hAnsi="Aptos Narrow"/>
+                <w:b/>
+                <w:bCs/>
+                <w:color w:val="215868" w:themeColor="accent5" w:themeShade="80"/>
+              </w:rPr>
+              <w:t xml:space="preserve">Lernsituation 10.2 </w:t>
+            </w:r>
+          </w:p>
+          <w:p>
+            <w:pPr>
+              <w:pStyle w:val="Listenabsatz"/>
+              <w:numPr>
+                <w:ilvl w:val="0"/>
+                <w:numId w:val="1"/>
+              </w:numPr>
+              <w:tabs>
+                <w:tab w:val="left" w:pos="989"/>
+                <w:tab w:val="right" w:pos="4533"/>
+              </w:tabs>
+              <w:rPr>
+                <w:rFonts w:ascii="Aptos Narrow" w:hAnsi="Aptos Narrow"/>
+                <w:color w:val="215868" w:themeColor="accent5" w:themeShade="80"/>
+              </w:rPr>
+            </w:pPr>
+            <w:r>
+              <w:rPr>
+                <w:rFonts w:ascii="Aptos Narrow" w:hAnsi="Aptos Narrow"/>
+                <w:color w:val="215868" w:themeColor="accent5" w:themeShade="80"/>
+              </w:rPr>
+              <w:t>Aufgabenteil 1</w:t>
+            </w:r>
+          </w:p>
+          <w:p>
+            <w:pPr>
+              <w:tabs>
+                <w:tab w:val="left" w:pos="989"/>
+                <w:tab w:val="right" w:pos="4533"/>
+              </w:tabs>
+              <w:ind w:left="357"/>
+              <w:rPr>
+                <w:rFonts w:ascii="Aptos Narrow" w:hAnsi="Aptos Narrow"/>
+                <w:color w:val="215868" w:themeColor="accent5" w:themeShade="80"/>
+                <w:sz w:val="20"/>
+                <w:szCs w:val="20"/>
+              </w:rPr>
+            </w:pPr>
+            <w:r>
+              <w:rPr>
+                <w:rFonts w:ascii="Aptos Narrow" w:hAnsi="Aptos Narrow"/>
+                <w:color w:val="215868" w:themeColor="accent5" w:themeShade="80"/>
+                <w:sz w:val="6"/>
+                <w:szCs w:val="6"/>
+              </w:rPr>
+              <w:br/>
+            </w:r>
+            <w:r>
+              <w:rPr>
+                <w:rFonts w:ascii="Aptos Narrow" w:hAnsi="Aptos Narrow"/>
+                <w:color w:val="215868" w:themeColor="accent5" w:themeShade="80"/>
+                <w:sz w:val="20"/>
+                <w:szCs w:val="20"/>
+              </w:rPr>
+              <w:t>Keine aktive Bearbeitung erforderlich, aber zum Nachlesen hilfreich</w:t>
+            </w:r>
+          </w:p>
+          <w:p>
+            <w:pPr>
+              <w:tabs>
+                <w:tab w:val="left" w:pos="989"/>
+                <w:tab w:val="right" w:pos="4533"/>
+              </w:tabs>
+              <w:ind w:left="357"/>
+              <w:rPr>
+                <w:rFonts w:ascii="Aptos Narrow" w:hAnsi="Aptos Narrow"/>
+                <w:color w:val="215868" w:themeColor="accent5" w:themeShade="80"/>
+                <w:sz w:val="6"/>
+                <w:szCs w:val="6"/>
+              </w:rPr>
+            </w:pPr>
+          </w:p>
+          <w:p>
+            <w:pPr>
+              <w:pStyle w:val="Listenabsatz"/>
+              <w:numPr>
+                <w:ilvl w:val="0"/>
+                <w:numId w:val="1"/>
+              </w:numPr>
+              <w:tabs>
+                <w:tab w:val="left" w:pos="989"/>
+                <w:tab w:val="right" w:pos="4533"/>
+              </w:tabs>
+              <w:rPr>
+                <w:rFonts w:ascii="Aptos Narrow" w:hAnsi="Aptos Narrow"/>
+                <w:color w:val="215868" w:themeColor="accent5" w:themeShade="80"/>
+                <w:sz w:val="20"/>
+                <w:szCs w:val="20"/>
+              </w:rPr>
+            </w:pPr>
+            <w:r>
+              <w:rPr>
+                <w:rFonts w:ascii="Aptos Narrow" w:hAnsi="Aptos Narrow"/>
+                <w:color w:val="215868" w:themeColor="accent5" w:themeShade="80"/>
+              </w:rPr>
+              <w:t xml:space="preserve">Aufgabenteil 2 </w:t>
+            </w:r>
+            <w:r>
+              <w:rPr>
+                <w:rFonts w:ascii="Aptos Narrow" w:hAnsi="Aptos Narrow"/>
+                <w:color w:val="215868" w:themeColor="accent5" w:themeShade="80"/>
+              </w:rPr>
+              <w:br/>
+            </w:r>
+            <w:r>
+              <w:rPr>
+                <w:rFonts w:ascii="Aptos Narrow" w:hAnsi="Aptos Narrow"/>
+                <w:color w:val="215868" w:themeColor="accent5" w:themeShade="80"/>
+                <w:sz w:val="6"/>
+                <w:szCs w:val="6"/>
+              </w:rPr>
+              <w:br/>
+            </w:r>
+            <w:r>
+              <w:rPr>
+                <w:rFonts w:ascii="Aptos Narrow" w:hAnsi="Aptos Narrow"/>
+                <w:color w:val="215868" w:themeColor="accent5" w:themeShade="80"/>
+                <w:sz w:val="20"/>
+                <w:szCs w:val="20"/>
+              </w:rPr>
+              <w:t>Arbeitsauftrag 1</w:t>
+            </w:r>
+            <w:r>
+              <w:rPr>
+                <w:rFonts w:ascii="Aptos Narrow" w:hAnsi="Aptos Narrow"/>
+                <w:color w:val="215868" w:themeColor="accent5" w:themeShade="80"/>
+                <w:sz w:val="20"/>
+                <w:szCs w:val="20"/>
+              </w:rPr>
+              <w:br/>
+              <w:t>Arbeitsauftrag 3</w:t>
+            </w:r>
+          </w:p>
+          <w:p>
+            <w:pPr>
+              <w:tabs>
+                <w:tab w:val="left" w:pos="989"/>
+                <w:tab w:val="right" w:pos="4533"/>
+              </w:tabs>
+              <w:rPr>
+                <w:rFonts w:ascii="Aptos Narrow" w:hAnsi="Aptos Narrow"/>
+                <w:color w:val="215868" w:themeColor="accent5" w:themeShade="80"/>
+                <w:sz w:val="6"/>
+                <w:szCs w:val="6"/>
+              </w:rPr>
+            </w:pPr>
+          </w:p>
+          <w:p>
+            <w:pPr>
+              <w:pStyle w:val="Listenabsatz"/>
+              <w:numPr>
+                <w:ilvl w:val="0"/>
+                <w:numId w:val="1"/>
+              </w:numPr>
+              <w:tabs>
+                <w:tab w:val="left" w:pos="989"/>
+                <w:tab w:val="right" w:pos="4533"/>
+              </w:tabs>
+              <w:rPr>
+                <w:rFonts w:ascii="Aptos Narrow" w:hAnsi="Aptos Narrow"/>
+                <w:color w:val="215868" w:themeColor="accent5" w:themeShade="80"/>
+              </w:rPr>
+            </w:pPr>
+            <w:r>
+              <w:rPr>
+                <w:rFonts w:ascii="Aptos Narrow" w:hAnsi="Aptos Narrow"/>
+                <w:color w:val="215868" w:themeColor="accent5" w:themeShade="80"/>
+              </w:rPr>
+              <w:t xml:space="preserve">Aufgabenteil 3 </w:t>
+            </w:r>
+            <w:r>
+              <w:rPr>
+                <w:rFonts w:ascii="Aptos Narrow" w:hAnsi="Aptos Narrow"/>
+                <w:color w:val="215868" w:themeColor="accent5" w:themeShade="80"/>
+              </w:rPr>
+              <w:br/>
+            </w:r>
+            <w:r>
+              <w:rPr>
+                <w:rFonts w:ascii="Aptos Narrow" w:hAnsi="Aptos Narrow"/>
+                <w:color w:val="215868" w:themeColor="accent5" w:themeShade="80"/>
+                <w:sz w:val="6"/>
+                <w:szCs w:val="6"/>
+              </w:rPr>
+              <w:br/>
+            </w:r>
+            <w:r>
+              <w:rPr>
+                <w:rFonts w:ascii="Aptos Narrow" w:hAnsi="Aptos Narrow"/>
+                <w:color w:val="215868" w:themeColor="accent5" w:themeShade="80"/>
+                <w:sz w:val="20"/>
+                <w:szCs w:val="20"/>
+              </w:rPr>
+              <w:t>Keine aktive Bearbeitung erforderlich, aber zum Nachlesen hilfreich</w:t>
+            </w:r>
+          </w:p>
+          <w:p>
+            <w:pPr>
+              <w:tabs>
+                <w:tab w:val="left" w:pos="989"/>
+                <w:tab w:val="right" w:pos="4533"/>
+              </w:tabs>
+              <w:rPr>
+                <w:rFonts w:ascii="Aptos Narrow" w:hAnsi="Aptos Narrow"/>
+                <w:color w:val="215868" w:themeColor="accent5" w:themeShade="80"/>
+                <w:sz w:val="6"/>
+                <w:szCs w:val="6"/>
+              </w:rPr>
+            </w:pPr>
+          </w:p>
+          <w:p>
+            <w:pPr>
+              <w:pStyle w:val="Listenabsatz"/>
+              <w:numPr>
+                <w:ilvl w:val="0"/>
+                <w:numId w:val="1"/>
+              </w:numPr>
+              <w:tabs>
+                <w:tab w:val="left" w:pos="989"/>
+                <w:tab w:val="right" w:pos="4533"/>
+              </w:tabs>
+              <w:rPr>
+                <w:rFonts w:ascii="Aptos Narrow" w:hAnsi="Aptos Narrow"/>
+                <w:color w:val="215868" w:themeColor="accent5" w:themeShade="80"/>
+                <w:sz w:val="20"/>
+                <w:szCs w:val="20"/>
+              </w:rPr>
+            </w:pPr>
+            <w:r>
+              <w:rPr>
+                <w:rFonts w:ascii="Aptos Narrow" w:hAnsi="Aptos Narrow"/>
+                <w:color w:val="215868" w:themeColor="accent5" w:themeShade="80"/>
+              </w:rPr>
+              <w:t>Aufgabenteil 4</w:t>
+            </w:r>
+            <w:r>
+              <w:rPr>
+                <w:rFonts w:ascii="Aptos Narrow" w:hAnsi="Aptos Narrow"/>
+                <w:color w:val="215868" w:themeColor="accent5" w:themeShade="80"/>
+              </w:rPr>
+              <w:br/>
+            </w:r>
+            <w:r>
+              <w:rPr>
+                <w:rFonts w:ascii="Aptos Narrow" w:hAnsi="Aptos Narrow"/>
+                <w:color w:val="215868" w:themeColor="accent5" w:themeShade="80"/>
+                <w:sz w:val="6"/>
+                <w:szCs w:val="6"/>
+              </w:rPr>
+              <w:br/>
+            </w:r>
+            <w:r>
+              <w:rPr>
+                <w:rFonts w:ascii="Aptos Narrow" w:hAnsi="Aptos Narrow"/>
+                <w:color w:val="215868" w:themeColor="accent5" w:themeShade="80"/>
+                <w:sz w:val="20"/>
+                <w:szCs w:val="20"/>
+              </w:rPr>
+              <w:t>Arbeitsauftrag 3:</w:t>
+            </w:r>
+            <w:r>
+              <w:rPr>
+                <w:rFonts w:ascii="Aptos Narrow" w:hAnsi="Aptos Narrow"/>
+                <w:color w:val="215868" w:themeColor="accent5" w:themeShade="80"/>
+                <w:sz w:val="20"/>
+                <w:szCs w:val="20"/>
+              </w:rPr>
+              <w:br/>
+              <w:t>3a) Kostenträgerblatt (alle Kosten/in Summen) erstellen</w:t>
+            </w:r>
+            <w:r>
+              <w:rPr>
+                <w:rFonts w:ascii="Aptos Narrow" w:hAnsi="Aptos Narrow"/>
+                <w:color w:val="215868" w:themeColor="accent5" w:themeShade="80"/>
+                <w:sz w:val="20"/>
+                <w:szCs w:val="20"/>
+              </w:rPr>
+              <w:br/>
+            </w:r>
+            <w:r>
+              <w:rPr>
+                <w:rFonts w:ascii="Aptos Narrow" w:hAnsi="Aptos Narrow"/>
+                <w:color w:val="215868" w:themeColor="accent5" w:themeShade="80"/>
+                <w:sz w:val="20"/>
+                <w:szCs w:val="20"/>
+              </w:rPr>
+              <w:t>3b) Zuschlagskalkulation für 1 Rasenmäher (pro Stück) erstellen (vorwärts)</w:t>
+            </w:r>
+            <w:r>
+              <w:rPr>
+                <w:rFonts w:ascii="Aptos Narrow" w:hAnsi="Aptos Narrow"/>
+                <w:color w:val="215868" w:themeColor="accent5" w:themeShade="80"/>
+                <w:sz w:val="20"/>
+                <w:szCs w:val="20"/>
+              </w:rPr>
+              <w:br/>
+            </w:r>
+            <w:r>
+              <w:rPr>
+                <w:rFonts w:ascii="Aptos Narrow" w:hAnsi="Aptos Narrow"/>
+                <w:color w:val="215868" w:themeColor="accent5" w:themeShade="80"/>
+                <w:sz w:val="20"/>
+                <w:szCs w:val="20"/>
+              </w:rPr>
+              <w:t>3c) Rückwärtskalkulation zu Ist</w:t>
+            </w:r>
+            <w:r>
+              <w:rPr>
+                <w:rFonts w:ascii="Aptos Narrow" w:hAnsi="Aptos Narrow"/>
+                <w:color w:val="215868" w:themeColor="accent5" w:themeShade="80"/>
+                <w:sz w:val="20"/>
+                <w:szCs w:val="20"/>
+              </w:rPr>
+              <w:t>-K</w:t>
+            </w:r>
+            <w:r>
+              <w:rPr>
+                <w:rFonts w:ascii="Aptos Narrow" w:hAnsi="Aptos Narrow"/>
+                <w:color w:val="215868" w:themeColor="accent5" w:themeShade="80"/>
+                <w:sz w:val="20"/>
+                <w:szCs w:val="20"/>
+              </w:rPr>
+              <w:t>osten</w:t>
+            </w:r>
+            <w:r>
+              <w:rPr>
+                <w:rFonts w:ascii="Aptos Narrow" w:hAnsi="Aptos Narrow"/>
+                <w:color w:val="215868" w:themeColor="accent5" w:themeShade="80"/>
+                <w:sz w:val="20"/>
+                <w:szCs w:val="20"/>
+              </w:rPr>
+              <w:br/>
+            </w:r>
+            <w:r>
+              <w:rPr>
+                <w:rFonts w:ascii="Aptos Narrow" w:hAnsi="Aptos Narrow"/>
+                <w:color w:val="215868" w:themeColor="accent5" w:themeShade="80"/>
+                <w:sz w:val="20"/>
+                <w:szCs w:val="20"/>
+              </w:rPr>
+              <w:t>3d) Differenzkalkulation zu Ist</w:t>
+            </w:r>
+            <w:r>
+              <w:rPr>
+                <w:rFonts w:ascii="Aptos Narrow" w:hAnsi="Aptos Narrow"/>
+                <w:color w:val="215868" w:themeColor="accent5" w:themeShade="80"/>
+                <w:sz w:val="20"/>
+                <w:szCs w:val="20"/>
+              </w:rPr>
+              <w:t>-K</w:t>
+            </w:r>
+            <w:r>
+              <w:rPr>
+                <w:rFonts w:ascii="Aptos Narrow" w:hAnsi="Aptos Narrow"/>
+                <w:color w:val="215868" w:themeColor="accent5" w:themeShade="80"/>
+                <w:sz w:val="20"/>
+                <w:szCs w:val="20"/>
+              </w:rPr>
+              <w:t>osten</w:t>
+            </w:r>
+          </w:p>
+          <w:p>
+            <w:pPr>
+              <w:tabs>
+                <w:tab w:val="left" w:pos="989"/>
+                <w:tab w:val="right" w:pos="4533"/>
+              </w:tabs>
+              <w:rPr>
+                <w:rFonts w:ascii="Aptos Narrow" w:hAnsi="Aptos Narrow"/>
+                <w:color w:val="215868" w:themeColor="accent5" w:themeShade="80"/>
+                <w:sz w:val="6"/>
+                <w:szCs w:val="6"/>
+              </w:rPr>
+            </w:pPr>
+          </w:p>
+          <w:p>
+            <w:pPr>
+              <w:pStyle w:val="Listenabsatz"/>
+              <w:numPr>
+                <w:ilvl w:val="0"/>
+                <w:numId w:val="1"/>
+              </w:numPr>
+              <w:tabs>
+                <w:tab w:val="left" w:pos="989"/>
+                <w:tab w:val="right" w:pos="4533"/>
+              </w:tabs>
+              <w:rPr>
+                <w:rFonts w:ascii="Aptos Narrow" w:hAnsi="Aptos Narrow"/>
+                <w:color w:val="215868" w:themeColor="accent5" w:themeShade="80"/>
+              </w:rPr>
+            </w:pPr>
+            <w:r>
+              <w:rPr>
+                <w:rFonts w:ascii="Aptos Narrow" w:hAnsi="Aptos Narrow"/>
+                <w:color w:val="215868" w:themeColor="accent5" w:themeShade="80"/>
+              </w:rPr>
+              <w:t>Vertiefende Aufgabe</w:t>
+            </w:r>
+          </w:p>
+          <w:p>
+            <w:pPr>
+              <w:tabs>
+                <w:tab w:val="left" w:pos="989"/>
+                <w:tab w:val="right" w:pos="4533"/>
+              </w:tabs>
+              <w:rPr>
+                <w:rFonts w:ascii="Aptos Narrow" w:hAnsi="Aptos Narrow"/>
+                <w:color w:val="215868" w:themeColor="accent5" w:themeShade="80"/>
+                <w:sz w:val="6"/>
+                <w:szCs w:val="6"/>
+              </w:rPr>
+            </w:pPr>
+          </w:p>
+          <w:p>
+            <w:pPr>
+              <w:tabs>
+                <w:tab w:val="left" w:pos="630"/>
+                <w:tab w:val="right" w:pos="4533"/>
+              </w:tabs>
+              <w:ind w:left="714" w:hanging="357"/>
+              <w:rPr>
+                <w:rFonts w:ascii="Aptos Narrow" w:hAnsi="Aptos Narrow"/>
+                <w:color w:val="215868" w:themeColor="accent5" w:themeShade="80"/>
+                <w:sz w:val="20"/>
+                <w:szCs w:val="20"/>
+              </w:rPr>
+            </w:pPr>
+            <w:r>
+              <w:rPr>
+                <w:rFonts w:ascii="Aptos Narrow" w:hAnsi="Aptos Narrow"/>
+                <w:color w:val="215868" w:themeColor="accent5" w:themeShade="80"/>
+                <w:sz w:val="20"/>
+                <w:szCs w:val="20"/>
+              </w:rPr>
+              <w:t>a) Informationen ermitteln und systematisch/tabellarisch herausschreiben</w:t>
+            </w:r>
+          </w:p>
+          <w:p>
+            <w:pPr>
+              <w:tabs>
+                <w:tab w:val="right" w:pos="4533"/>
+              </w:tabs>
+              <w:ind w:left="555" w:hanging="198"/>
+              <w:rPr>
+                <w:rFonts w:ascii="Aptos Narrow" w:hAnsi="Aptos Narrow"/>
+                <w:color w:val="215868" w:themeColor="accent5" w:themeShade="80"/>
+                <w:sz w:val="20"/>
+                <w:szCs w:val="20"/>
+              </w:rPr>
+            </w:pPr>
+            <w:r>
+              <w:rPr>
+                <w:rFonts w:ascii="Aptos Narrow" w:hAnsi="Aptos Narrow"/>
+                <w:color w:val="215868" w:themeColor="accent5" w:themeShade="80"/>
+                <w:sz w:val="20"/>
+                <w:szCs w:val="20"/>
+              </w:rPr>
+              <w:t xml:space="preserve">b) </w:t>
+            </w:r>
+            <w:r>
+              <w:rPr>
+                <w:rFonts w:ascii="Aptos Narrow" w:hAnsi="Aptos Narrow"/>
+                <w:color w:val="215868" w:themeColor="accent5" w:themeShade="80"/>
+                <w:sz w:val="20"/>
+                <w:szCs w:val="20"/>
+              </w:rPr>
+              <w:t>Betriebsabrechnungsbogen (</w:t>
+            </w:r>
+            <w:r>
+              <w:rPr>
+                <w:rFonts w:ascii="Aptos Narrow" w:hAnsi="Aptos Narrow"/>
+                <w:color w:val="215868" w:themeColor="accent5" w:themeShade="80"/>
+                <w:sz w:val="20"/>
+                <w:szCs w:val="20"/>
+              </w:rPr>
+              <w:t>BAB</w:t>
+            </w:r>
+            <w:r>
+              <w:rPr>
+                <w:rFonts w:ascii="Aptos Narrow" w:hAnsi="Aptos Narrow"/>
+                <w:color w:val="215868" w:themeColor="accent5" w:themeShade="80"/>
+                <w:sz w:val="20"/>
+                <w:szCs w:val="20"/>
+              </w:rPr>
+              <w:t>)</w:t>
+            </w:r>
+            <w:r>
+              <w:rPr>
+                <w:rFonts w:ascii="Aptos Narrow" w:hAnsi="Aptos Narrow"/>
+                <w:color w:val="215868" w:themeColor="accent5" w:themeShade="80"/>
+                <w:sz w:val="20"/>
+                <w:szCs w:val="20"/>
+              </w:rPr>
+              <w:t xml:space="preserve"> erstellen und Zuschlagssätze (Zuschlag</w:t>
+            </w:r>
+            <w:r>
+              <w:rPr>
+                <w:rFonts w:ascii="Aptos Narrow" w:hAnsi="Aptos Narrow"/>
+                <w:color w:val="215868" w:themeColor="accent5" w:themeShade="80"/>
+                <w:sz w:val="20"/>
+                <w:szCs w:val="20"/>
+              </w:rPr>
+              <w:t>s</w:t>
+            </w:r>
+            <w:r>
+              <w:rPr>
+                <w:rFonts w:ascii="Aptos Narrow" w:hAnsi="Aptos Narrow"/>
+                <w:color w:val="215868" w:themeColor="accent5" w:themeShade="80"/>
+                <w:sz w:val="20"/>
+                <w:szCs w:val="20"/>
+              </w:rPr>
+              <w:t xml:space="preserve">sätze </w:t>
+            </w:r>
+            <w:r>
+              <w:rPr>
+                <w:rFonts w:ascii="Aptos Narrow" w:hAnsi="Aptos Narrow"/>
+                <w:color w:val="215868" w:themeColor="accent5" w:themeShade="80"/>
+                <w:sz w:val="20"/>
+                <w:szCs w:val="20"/>
+              </w:rPr>
+              <w:t>mit</w:t>
+            </w:r>
+            <w:r>
+              <w:rPr>
+                <w:rFonts w:ascii="Aptos Narrow" w:hAnsi="Aptos Narrow"/>
+                <w:color w:val="215868" w:themeColor="accent5" w:themeShade="80"/>
+                <w:sz w:val="20"/>
+                <w:szCs w:val="20"/>
+              </w:rPr>
+              <w:t xml:space="preserve"> 5 Nachkommastellen) bilden</w:t>
+            </w:r>
+          </w:p>
+          <w:p>
+            <w:pPr>
+              <w:tabs>
+                <w:tab w:val="right" w:pos="4533"/>
+              </w:tabs>
+              <w:ind w:left="630" w:hanging="273"/>
+              <w:rPr>
+                <w:rFonts w:ascii="Aptos Narrow" w:hAnsi="Aptos Narrow"/>
+                <w:color w:val="215868" w:themeColor="accent5" w:themeShade="80"/>
+                <w:sz w:val="20"/>
+                <w:szCs w:val="20"/>
+              </w:rPr>
+            </w:pPr>
+            <w:r>
+              <w:rPr>
+                <w:rFonts w:ascii="Aptos Narrow" w:hAnsi="Aptos Narrow"/>
+                <w:color w:val="215868" w:themeColor="accent5" w:themeShade="80"/>
+                <w:sz w:val="20"/>
+                <w:szCs w:val="20"/>
+              </w:rPr>
+              <w:t xml:space="preserve">c) Kostenträgerblatt (jeweils für alle Kosten/Summen und zusätzlich pro qm) </w:t>
+            </w:r>
+          </w:p>
+          <w:p>
+            <w:pPr>
+              <w:tabs>
+                <w:tab w:val="right" w:pos="4533"/>
+              </w:tabs>
+              <w:ind w:left="630" w:hanging="273"/>
+              <w:rPr>
+                <w:rFonts w:ascii="Aptos Narrow" w:hAnsi="Aptos Narrow"/>
+                <w:color w:val="215868" w:themeColor="accent5" w:themeShade="80"/>
+                <w:sz w:val="20"/>
+                <w:szCs w:val="20"/>
+              </w:rPr>
+            </w:pPr>
+            <w:r>
+              <w:rPr>
+                <w:rFonts w:ascii="Aptos Narrow" w:hAnsi="Aptos Narrow"/>
+                <w:color w:val="215868" w:themeColor="accent5" w:themeShade="80"/>
+                <w:sz w:val="20"/>
+                <w:szCs w:val="20"/>
+              </w:rPr>
+              <w:t>d) Kostenträgerstückrechnung</w:t>
+            </w:r>
+          </w:p>
+          <w:p>
+            <w:pPr>
+              <w:tabs>
+                <w:tab w:val="right" w:pos="4533"/>
+              </w:tabs>
+              <w:ind w:left="630" w:hanging="273"/>
+              <w:rPr>
+                <w:rFonts w:ascii="Aptos Narrow" w:hAnsi="Aptos Narrow"/>
+                <w:color w:val="215868" w:themeColor="accent5" w:themeShade="80"/>
+                <w:sz w:val="20"/>
+                <w:szCs w:val="20"/>
+              </w:rPr>
+            </w:pPr>
+            <w:r>
+              <w:rPr>
+                <w:rFonts w:ascii="Aptos Narrow" w:hAnsi="Aptos Narrow"/>
+                <w:color w:val="215868" w:themeColor="accent5" w:themeShade="80"/>
+                <w:sz w:val="20"/>
+                <w:szCs w:val="20"/>
+              </w:rPr>
+              <w:t>e) Zuschlagskalku</w:t>
+            </w:r>
+            <w:r>
+              <w:rPr>
+                <w:rFonts w:ascii="Aptos Narrow" w:hAnsi="Aptos Narrow"/>
+                <w:color w:val="215868" w:themeColor="accent5" w:themeShade="80"/>
+                <w:sz w:val="20"/>
+                <w:szCs w:val="20"/>
+              </w:rPr>
+              <w:t>lation (rückwärts)</w:t>
+            </w:r>
+          </w:p>
+          <w:p>
+            <w:pPr>
+              <w:tabs>
+                <w:tab w:val="right" w:pos="4533"/>
+              </w:tabs>
+              <w:ind w:left="630" w:hanging="273"/>
+              <w:rPr>
+                <w:rFonts w:ascii="Aptos Narrow" w:hAnsi="Aptos Narrow"/>
+                <w:color w:val="215868" w:themeColor="accent5" w:themeShade="80"/>
+              </w:rPr>
+            </w:pPr>
+            <w:r>
+              <w:rPr>
+                <w:rFonts w:ascii="Aptos Narrow" w:hAnsi="Aptos Narrow"/>
+                <w:color w:val="215868" w:themeColor="accent5" w:themeShade="80"/>
+                <w:sz w:val="20"/>
+                <w:szCs w:val="20"/>
+              </w:rPr>
+              <w:t>f) Zuschlagskalkulation (</w:t>
+            </w:r>
+            <w:r>
+              <w:rPr>
+                <w:rFonts w:ascii="Aptos Narrow" w:hAnsi="Aptos Narrow"/>
+                <w:color w:val="215868" w:themeColor="accent5" w:themeShade="80"/>
+                <w:sz w:val="20"/>
+                <w:szCs w:val="20"/>
+              </w:rPr>
+              <w:t>different</w:t>
+            </w:r>
+            <w:r>
+              <w:rPr>
+                <w:rFonts w:ascii="Aptos Narrow" w:hAnsi="Aptos Narrow"/>
+                <w:color w:val="215868" w:themeColor="accent5" w:themeShade="80"/>
+                <w:sz w:val="20"/>
+                <w:szCs w:val="20"/>
+              </w:rPr>
+              <w:t>)</w:t>
+            </w:r>
           </w:p>
         </w:tc>
         <w:tc>
@@ -694,12 +2123,62 @@
           </w:tcPr>
           <w:p>
             <w:pPr>
-              <w:rPr>
-                <w:rFonts w:ascii="Aptos Narrow" w:hAnsi="Aptos Narrow"/>
-                <w:b/>
-                <w:color w:val="244061" w:themeColor="accent1" w:themeShade="80"/>
-              </w:rPr>
-            </w:pPr>
+              <w:spacing w:after="120"/>
+              <w:rPr>
+                <w:rFonts w:ascii="Aptos Narrow" w:hAnsi="Aptos Narrow"/>
+                <w:b/>
+                <w:color w:val="244061" w:themeColor="accent1" w:themeShade="80"/>
+              </w:rPr>
+            </w:pPr>
+            <w:r>
+              <w:rPr>
+                <w:rFonts w:ascii="Aptos Narrow" w:hAnsi="Aptos Narrow"/>
+                <w:b/>
+                <w:color w:val="244061" w:themeColor="accent1" w:themeShade="80"/>
+              </w:rPr>
+              <w:lastRenderedPageBreak/>
+              <w:t>Handelskalkulation</w:t>
+            </w:r>
+          </w:p>
+          <w:p>
+            <w:pPr>
+              <w:rPr>
+                <w:rFonts w:ascii="Aptos Narrow" w:hAnsi="Aptos Narrow"/>
+                <w:bCs/>
+                <w:color w:val="244061" w:themeColor="accent1" w:themeShade="80"/>
+                <w:sz w:val="20"/>
+                <w:szCs w:val="20"/>
+              </w:rPr>
+            </w:pPr>
+            <w:r>
+              <w:rPr>
+                <w:rFonts w:ascii="Aptos Narrow" w:hAnsi="Aptos Narrow"/>
+                <w:bCs/>
+                <w:color w:val="244061" w:themeColor="accent1" w:themeShade="80"/>
+                <w:sz w:val="20"/>
+                <w:szCs w:val="20"/>
+              </w:rPr>
+              <w:t>Industriekalkulation</w:t>
+            </w:r>
+          </w:p>
+          <w:p>
+            <w:pPr>
+              <w:rPr>
+                <w:rFonts w:ascii="Aptos Narrow" w:hAnsi="Aptos Narrow"/>
+                <w:b/>
+                <w:color w:val="244061" w:themeColor="accent1" w:themeShade="80"/>
+              </w:rPr>
+            </w:pPr>
+            <w:r>
+              <w:rPr>
+                <w:rFonts w:ascii="Aptos Narrow" w:hAnsi="Aptos Narrow"/>
+                <w:bCs/>
+                <w:color w:val="244061" w:themeColor="accent1" w:themeShade="80"/>
+                <w:sz w:val="20"/>
+                <w:szCs w:val="20"/>
+              </w:rPr>
+              <w:t>Zuschlagskalkulation</w:t>
+            </w:r>
           </w:p>
         </w:tc>
         <w:tc>
@@ -712,11 +2191,71 @@
                 <w:tab w:val="left" w:pos="989"/>
                 <w:tab w:val="right" w:pos="4533"/>
               </w:tabs>
-              <w:rPr>
-                <w:rFonts w:ascii="Aptos Narrow" w:hAnsi="Aptos Narrow"/>
-                <w:color w:val="215868" w:themeColor="accent5" w:themeShade="80"/>
-              </w:rPr>
-            </w:pPr>
+              <w:spacing w:after="120"/>
+              <w:rPr>
+                <w:rFonts w:ascii="Aptos Narrow" w:hAnsi="Aptos Narrow"/>
+                <w:b/>
+                <w:bCs/>
+                <w:color w:val="215868" w:themeColor="accent5" w:themeShade="80"/>
+              </w:rPr>
+            </w:pPr>
+            <w:r>
+              <w:rPr>
+                <w:rFonts w:ascii="Aptos Narrow" w:hAnsi="Aptos Narrow"/>
+                <w:b/>
+                <w:bCs/>
+                <w:color w:val="215868" w:themeColor="accent5" w:themeShade="80"/>
+              </w:rPr>
+              <w:t>Lernsituation 10.3</w:t>
+            </w:r>
+          </w:p>
+          <w:p>
+            <w:pPr>
+              <w:pStyle w:val="Listenabsatz"/>
+              <w:numPr>
+                <w:ilvl w:val="0"/>
+                <w:numId w:val="1"/>
+              </w:numPr>
+              <w:tabs>
+                <w:tab w:val="left" w:pos="989"/>
+                <w:tab w:val="right" w:pos="4533"/>
+              </w:tabs>
+              <w:rPr>
+                <w:rFonts w:ascii="Aptos Narrow" w:hAnsi="Aptos Narrow"/>
+                <w:color w:val="215868" w:themeColor="accent5" w:themeShade="80"/>
+              </w:rPr>
+            </w:pPr>
+            <w:r>
+              <w:rPr>
+                <w:rFonts w:ascii="Aptos Narrow" w:hAnsi="Aptos Narrow"/>
+                <w:color w:val="215868" w:themeColor="accent5" w:themeShade="80"/>
+              </w:rPr>
+              <w:t>Arbeitsaufträge</w:t>
+            </w:r>
+          </w:p>
+          <w:p>
+            <w:pPr>
+              <w:pStyle w:val="Listenabsatz"/>
+              <w:numPr>
+                <w:ilvl w:val="0"/>
+                <w:numId w:val="1"/>
+              </w:numPr>
+              <w:tabs>
+                <w:tab w:val="left" w:pos="989"/>
+                <w:tab w:val="right" w:pos="4533"/>
+              </w:tabs>
+              <w:rPr>
+                <w:rFonts w:ascii="Aptos Narrow" w:hAnsi="Aptos Narrow"/>
+                <w:color w:val="215868" w:themeColor="accent5" w:themeShade="80"/>
+              </w:rPr>
+            </w:pPr>
+            <w:r>
+              <w:rPr>
+                <w:rFonts w:ascii="Aptos Narrow" w:hAnsi="Aptos Narrow"/>
+                <w:color w:val="215868" w:themeColor="accent5" w:themeShade="80"/>
+              </w:rPr>
+              <w:t>Vertiefende Aufgabe</w:t>
+            </w:r>
           </w:p>
         </w:tc>
         <w:tc>
@@ -870,6 +2409,403 @@
           </w:p>
         </w:tc>
       </w:tr>
+    </w:tbl>
+    <w:p/>
+    <w:tbl>
+      <w:tblPr>
+        <w:tblStyle w:val="Tabellenraster"/>
+        <w:tblW w:w="5011" w:type="pct"/>
+        <w:tblLayout w:type="fixed"/>
+        <w:tblCellMar>
+          <w:top w:w="57" w:type="dxa"/>
+          <w:left w:w="57" w:type="dxa"/>
+          <w:bottom w:w="57" w:type="dxa"/>
+          <w:right w:w="57" w:type="dxa"/>
+        </w:tblCellMar>
+        <w:tblLook w:val="04A0" w:firstRow="1" w:lastRow="0" w:firstColumn="1" w:lastColumn="0" w:noHBand="0" w:noVBand="1"/>
+      </w:tblPr>
+      <w:tblGrid>
+        <w:gridCol w:w="15729"/>
+      </w:tblGrid>
+      <w:tr>
+        <w:trPr>
+          <w:cantSplit/>
+          <w:trHeight w:val="964"/>
+        </w:trPr>
+        <w:tc>
+          <w:tcPr>
+            <w:tcW w:w="15729" w:type="dxa"/>
+            <w:shd w:val="clear" w:color="auto" w:fill="F2F2F2" w:themeFill="background1" w:themeFillShade="F2"/>
+          </w:tcPr>
+          <w:p>
+            <w:pPr>
+              <w:spacing w:after="120"/>
+              <w:rPr>
+                <w:rFonts w:ascii="Aptos Narrow" w:hAnsi="Aptos Narrow"/>
+                <w:b/>
+                <w:color w:val="262626" w:themeColor="text1" w:themeTint="D9"/>
+              </w:rPr>
+            </w:pPr>
+            <w:r>
+              <w:rPr>
+                <w:rFonts w:ascii="Aptos Narrow" w:hAnsi="Aptos Narrow"/>
+                <w:b/>
+                <w:color w:val="262626" w:themeColor="text1" w:themeTint="D9"/>
+              </w:rPr>
+              <w:t>Teilkostenrechnung</w:t>
+            </w:r>
+          </w:p>
+          <w:p>
+            <w:pPr>
+              <w:autoSpaceDE w:val="0"/>
+              <w:autoSpaceDN w:val="0"/>
+              <w:adjustRightInd w:val="0"/>
+              <w:spacing w:line="240" w:lineRule="auto"/>
+              <w:rPr>
+                <w:rFonts w:ascii="Aptos Narrow" w:eastAsia="MS Gothic" w:hAnsi="Aptos Narrow"/>
+                <w:color w:val="262626" w:themeColor="text1" w:themeTint="D9"/>
+                <w:sz w:val="20"/>
+                <w:szCs w:val="20"/>
+              </w:rPr>
+            </w:pPr>
+            <w:r>
+              <w:rPr>
+                <w:rFonts w:ascii="Aptos Narrow" w:hAnsi="Aptos Narrow" w:cs="GlyphLessFont"/>
+                <w:color w:val="262626" w:themeColor="text1" w:themeTint="D9"/>
+                <w:sz w:val="20"/>
+                <w:szCs w:val="20"/>
+              </w:rPr>
+              <w:t xml:space="preserve">Die Teilkostenrechnung unterscheidet zwischen Kosten, die sich mit der Produktionsmenge verändern (variable Kosten), und solchen, die </w:t>
+            </w:r>
+            <w:proofErr w:type="gramStart"/>
+            <w:r>
+              <w:rPr>
+                <w:rFonts w:ascii="Aptos Narrow" w:hAnsi="Aptos Narrow" w:cs="GlyphLessFont"/>
+                <w:color w:val="262626" w:themeColor="text1" w:themeTint="D9"/>
+                <w:sz w:val="20"/>
+                <w:szCs w:val="20"/>
+              </w:rPr>
+              <w:t>gleich bleiben</w:t>
+            </w:r>
+            <w:proofErr w:type="gramEnd"/>
+            <w:r>
+              <w:rPr>
+                <w:rFonts w:ascii="Aptos Narrow" w:hAnsi="Aptos Narrow" w:cs="GlyphLessFont"/>
+                <w:color w:val="262626" w:themeColor="text1" w:themeTint="D9"/>
+                <w:sz w:val="20"/>
+                <w:szCs w:val="20"/>
+              </w:rPr>
+              <w:t xml:space="preserve"> (fixe Kosten). Den Produkten werden nur die variablen Kosten zugerechnet, weil nur sie für kurzfristige Entscheidungen wirklich wichtig sind.</w:t>
+            </w:r>
+          </w:p>
+        </w:tc>
+      </w:tr>
+    </w:tbl>
+    <w:p/>
+    <w:tbl>
+      <w:tblPr>
+        <w:tblStyle w:val="Tabellenraster"/>
+        <w:tblW w:w="5011" w:type="pct"/>
+        <w:tblLayout w:type="fixed"/>
+        <w:tblCellMar>
+          <w:top w:w="57" w:type="dxa"/>
+          <w:left w:w="57" w:type="dxa"/>
+          <w:bottom w:w="57" w:type="dxa"/>
+          <w:right w:w="57" w:type="dxa"/>
+        </w:tblCellMar>
+        <w:tblLook w:val="04A0" w:firstRow="1" w:lastRow="0" w:firstColumn="1" w:lastColumn="0" w:noHBand="0" w:noVBand="1"/>
+      </w:tblPr>
+      <w:tblGrid>
+        <w:gridCol w:w="2991"/>
+        <w:gridCol w:w="6502"/>
+        <w:gridCol w:w="1559"/>
+        <w:gridCol w:w="1559"/>
+        <w:gridCol w:w="1559"/>
+        <w:gridCol w:w="1559"/>
+      </w:tblGrid>
+      <w:tr>
+        <w:trPr>
+          <w:cantSplit/>
+          <w:trHeight w:val="567"/>
+          <w:tblHeader/>
+        </w:trPr>
+        <w:tc>
+          <w:tcPr>
+            <w:tcW w:w="2991" w:type="dxa"/>
+            <w:shd w:val="clear" w:color="auto" w:fill="B8CCE4" w:themeFill="accent1" w:themeFillTint="66"/>
+            <w:vAlign w:val="center"/>
+          </w:tcPr>
+          <w:p>
+            <w:pPr>
+              <w:rPr>
+                <w:rFonts w:ascii="Aptos Narrow" w:hAnsi="Aptos Narrow"/>
+                <w:b/>
+                <w:color w:val="244061" w:themeColor="accent1" w:themeShade="80"/>
+                <w:sz w:val="20"/>
+                <w:szCs w:val="20"/>
+              </w:rPr>
+            </w:pPr>
+            <w:r>
+              <w:rPr>
+                <w:rFonts w:ascii="Aptos Narrow" w:hAnsi="Aptos Narrow"/>
+                <w:b/>
+                <w:color w:val="244061" w:themeColor="accent1" w:themeShade="80"/>
+                <w:sz w:val="20"/>
+                <w:szCs w:val="20"/>
+              </w:rPr>
+              <w:t>Themen</w:t>
+            </w:r>
+          </w:p>
+        </w:tc>
+        <w:tc>
+          <w:tcPr>
+            <w:tcW w:w="6502" w:type="dxa"/>
+            <w:shd w:val="clear" w:color="auto" w:fill="B8CCE4" w:themeFill="accent1" w:themeFillTint="66"/>
+            <w:vAlign w:val="center"/>
+          </w:tcPr>
+          <w:p>
+            <w:pPr>
+              <w:jc w:val="center"/>
+              <w:rPr>
+                <w:rFonts w:ascii="Aptos Narrow" w:hAnsi="Aptos Narrow"/>
+                <w:b/>
+                <w:color w:val="244061" w:themeColor="accent1" w:themeShade="80"/>
+                <w:sz w:val="20"/>
+                <w:szCs w:val="20"/>
+              </w:rPr>
+            </w:pPr>
+            <w:r>
+              <w:rPr>
+                <w:rFonts w:ascii="Aptos Narrow" w:hAnsi="Aptos Narrow"/>
+                <w:b/>
+                <w:color w:val="244061" w:themeColor="accent1" w:themeShade="80"/>
+                <w:sz w:val="20"/>
+                <w:szCs w:val="20"/>
+              </w:rPr>
+              <w:t>Lernsituation, Arbeitsaufträge und vertiefende Aufgaben</w:t>
+            </w:r>
+          </w:p>
+        </w:tc>
+        <w:tc>
+          <w:tcPr>
+            <w:tcW w:w="1559" w:type="dxa"/>
+            <w:shd w:val="clear" w:color="auto" w:fill="B8CCE4" w:themeFill="accent1" w:themeFillTint="66"/>
+            <w:vAlign w:val="center"/>
+          </w:tcPr>
+          <w:p>
+            <w:pPr>
+              <w:widowControl w:val="0"/>
+              <w:spacing w:line="259" w:lineRule="auto"/>
+              <w:jc w:val="center"/>
+              <w:rPr>
+                <w:rFonts w:ascii="Aptos Narrow" w:hAnsi="Aptos Narrow"/>
+                <w:b/>
+                <w:color w:val="244061" w:themeColor="accent1" w:themeShade="80"/>
+                <w:sz w:val="20"/>
+                <w:szCs w:val="20"/>
+              </w:rPr>
+            </w:pPr>
+            <w:r>
+              <w:rPr>
+                <w:rFonts w:ascii="Aptos Narrow" w:hAnsi="Aptos Narrow"/>
+                <w:b/>
+                <w:color w:val="244061" w:themeColor="accent1" w:themeShade="80"/>
+                <w:sz w:val="20"/>
+                <w:szCs w:val="20"/>
+              </w:rPr>
+              <w:t>Erledigt</w:t>
+            </w:r>
+            <w:r>
+              <w:rPr>
+                <w:rFonts w:ascii="Aptos Narrow" w:hAnsi="Aptos Narrow"/>
+                <w:b/>
+                <w:color w:val="244061" w:themeColor="accent1" w:themeShade="80"/>
+                <w:sz w:val="20"/>
+                <w:szCs w:val="20"/>
+              </w:rPr>
+              <w:t xml:space="preserve"> am …</w:t>
+            </w:r>
+          </w:p>
+        </w:tc>
+        <w:tc>
+          <w:tcPr>
+            <w:tcW w:w="1559" w:type="dxa"/>
+            <w:shd w:val="clear" w:color="auto" w:fill="B8CCE4" w:themeFill="accent1" w:themeFillTint="66"/>
+            <w:vAlign w:val="center"/>
+          </w:tcPr>
+          <w:p>
+            <w:pPr>
+              <w:jc w:val="center"/>
+              <w:rPr>
+                <w:rFonts w:ascii="Aptos Narrow" w:hAnsi="Aptos Narrow"/>
+                <w:b/>
+                <w:color w:val="244061" w:themeColor="accent1" w:themeShade="80"/>
+                <w:sz w:val="20"/>
+                <w:szCs w:val="20"/>
+              </w:rPr>
+            </w:pPr>
+            <w:r>
+              <w:rPr>
+                <w:rFonts w:ascii="Aptos Narrow" w:hAnsi="Aptos Narrow"/>
+                <w:b/>
+                <w:color w:val="244061" w:themeColor="accent1" w:themeShade="80"/>
+                <w:sz w:val="20"/>
+                <w:szCs w:val="20"/>
+              </w:rPr>
+              <w:t>Feedback</w:t>
+            </w:r>
+          </w:p>
+        </w:tc>
+        <w:tc>
+          <w:tcPr>
+            <w:tcW w:w="1559" w:type="dxa"/>
+            <w:shd w:val="clear" w:color="auto" w:fill="B8CCE4" w:themeFill="accent1" w:themeFillTint="66"/>
+            <w:vAlign w:val="center"/>
+          </w:tcPr>
+          <w:p>
+            <w:pPr>
+              <w:jc w:val="center"/>
+              <w:rPr>
+                <w:rFonts w:ascii="Aptos Narrow" w:hAnsi="Aptos Narrow"/>
+                <w:b/>
+                <w:color w:val="244061" w:themeColor="accent1" w:themeShade="80"/>
+                <w:sz w:val="20"/>
+                <w:szCs w:val="20"/>
+              </w:rPr>
+            </w:pPr>
+            <w:r>
+              <w:rPr>
+                <w:rFonts w:ascii="Aptos Narrow" w:hAnsi="Aptos Narrow"/>
+                <w:b/>
+                <w:color w:val="244061" w:themeColor="accent1" w:themeShade="80"/>
+                <w:sz w:val="20"/>
+                <w:szCs w:val="20"/>
+              </w:rPr>
+              <w:t>Nachbesserung erforderlich</w:t>
+            </w:r>
+          </w:p>
+        </w:tc>
+        <w:tc>
+          <w:tcPr>
+            <w:tcW w:w="1559" w:type="dxa"/>
+            <w:shd w:val="clear" w:color="auto" w:fill="B8CCE4" w:themeFill="accent1" w:themeFillTint="66"/>
+            <w:vAlign w:val="center"/>
+          </w:tcPr>
+          <w:p>
+            <w:pPr>
+              <w:jc w:val="center"/>
+              <w:rPr>
+                <w:rFonts w:ascii="Aptos Narrow" w:hAnsi="Aptos Narrow"/>
+                <w:b/>
+                <w:color w:val="244061" w:themeColor="accent1" w:themeShade="80"/>
+                <w:sz w:val="20"/>
+                <w:szCs w:val="20"/>
+              </w:rPr>
+            </w:pPr>
+            <w:r>
+              <w:rPr>
+                <w:rFonts w:ascii="Aptos Narrow" w:hAnsi="Aptos Narrow"/>
+                <w:b/>
+                <w:color w:val="244061" w:themeColor="accent1" w:themeShade="80"/>
+                <w:sz w:val="20"/>
+                <w:szCs w:val="20"/>
+              </w:rPr>
+              <w:t xml:space="preserve">Unterschrift </w:t>
+            </w:r>
+            <w:r>
+              <w:rPr>
+                <w:rFonts w:ascii="Aptos Narrow" w:hAnsi="Aptos Narrow"/>
+                <w:b/>
+                <w:color w:val="244061" w:themeColor="accent1" w:themeShade="80"/>
+                <w:sz w:val="20"/>
+                <w:szCs w:val="20"/>
+              </w:rPr>
+              <w:br/>
+              <w:t>Ausbildende</w:t>
+            </w:r>
+          </w:p>
+        </w:tc>
+      </w:tr>
+      <w:tr>
+        <w:trPr>
+          <w:cantSplit/>
+          <w:trHeight w:val="227"/>
+        </w:trPr>
+        <w:tc>
+          <w:tcPr>
+            <w:tcW w:w="15729" w:type="dxa"/>
+            <w:gridSpan w:val="6"/>
+            <w:shd w:val="clear" w:color="auto" w:fill="DBE5F1" w:themeFill="accent1" w:themeFillTint="33"/>
+            <w:vAlign w:val="center"/>
+          </w:tcPr>
+          <w:p>
+            <w:pPr>
+              <w:jc w:val="right"/>
+              <w:rPr>
+                <w:rFonts w:ascii="Aptos Narrow" w:hAnsi="Aptos Narrow"/>
+                <w:b/>
+                <w:color w:val="244061" w:themeColor="accent1" w:themeShade="80"/>
+                <w:sz w:val="18"/>
+                <w:szCs w:val="18"/>
+              </w:rPr>
+            </w:pPr>
+            <w:proofErr w:type="spellStart"/>
+            <w:r>
+              <w:rPr>
+                <w:rFonts w:ascii="Aptos Narrow" w:hAnsi="Aptos Narrow"/>
+                <w:b/>
+                <w:color w:val="244061" w:themeColor="accent1" w:themeShade="80"/>
+                <w:sz w:val="18"/>
+                <w:szCs w:val="18"/>
+              </w:rPr>
+              <w:t>BüroWelt</w:t>
+            </w:r>
+            <w:proofErr w:type="spellEnd"/>
+            <w:r>
+              <w:rPr>
+                <w:rFonts w:ascii="Aptos Narrow" w:hAnsi="Aptos Narrow"/>
+                <w:b/>
+                <w:color w:val="244061" w:themeColor="accent1" w:themeShade="80"/>
+                <w:sz w:val="18"/>
+                <w:szCs w:val="18"/>
+              </w:rPr>
+              <w:t xml:space="preserve"> &amp; </w:t>
+            </w:r>
+            <w:proofErr w:type="spellStart"/>
+            <w:r>
+              <w:rPr>
+                <w:rFonts w:ascii="Aptos Narrow" w:hAnsi="Aptos Narrow"/>
+                <w:b/>
+                <w:color w:val="244061" w:themeColor="accent1" w:themeShade="80"/>
+                <w:sz w:val="18"/>
+                <w:szCs w:val="18"/>
+              </w:rPr>
+              <w:t>BüroMaterial</w:t>
+            </w:r>
+            <w:proofErr w:type="spellEnd"/>
+            <w:r>
+              <w:rPr>
+                <w:rFonts w:ascii="Aptos Narrow" w:hAnsi="Aptos Narrow"/>
+                <w:b/>
+                <w:color w:val="244061" w:themeColor="accent1" w:themeShade="80"/>
+                <w:sz w:val="18"/>
+                <w:szCs w:val="18"/>
+              </w:rPr>
+              <w:t xml:space="preserve"> – Teil 1, Lernfeld </w:t>
+            </w:r>
+            <w:r>
+              <w:rPr>
+                <w:rFonts w:ascii="Aptos Narrow" w:hAnsi="Aptos Narrow"/>
+                <w:b/>
+                <w:color w:val="244061" w:themeColor="accent1" w:themeShade="80"/>
+                <w:sz w:val="18"/>
+                <w:szCs w:val="18"/>
+              </w:rPr>
+              <w:t>10</w:t>
+            </w:r>
+          </w:p>
+        </w:tc>
+      </w:tr>
       <w:tr>
         <w:trPr>
           <w:cantSplit/>
@@ -882,12 +2818,61 @@
           </w:tcPr>
           <w:p>
             <w:pPr>
-              <w:rPr>
-                <w:rFonts w:ascii="Aptos Narrow" w:hAnsi="Aptos Narrow"/>
-                <w:b/>
-                <w:color w:val="244061" w:themeColor="accent1" w:themeShade="80"/>
-              </w:rPr>
-            </w:pPr>
+              <w:spacing w:after="120"/>
+              <w:rPr>
+                <w:rFonts w:ascii="Aptos Narrow" w:hAnsi="Aptos Narrow"/>
+                <w:b/>
+                <w:color w:val="244061" w:themeColor="accent1" w:themeShade="80"/>
+              </w:rPr>
+            </w:pPr>
+            <w:r>
+              <w:rPr>
+                <w:rFonts w:ascii="Aptos Narrow" w:hAnsi="Aptos Narrow"/>
+                <w:b/>
+                <w:color w:val="244061" w:themeColor="accent1" w:themeShade="80"/>
+              </w:rPr>
+              <w:t>Deckungsbeitragsrechnung</w:t>
+            </w:r>
+          </w:p>
+          <w:p>
+            <w:pPr>
+              <w:rPr>
+                <w:rFonts w:ascii="Aptos Narrow" w:hAnsi="Aptos Narrow"/>
+                <w:bCs/>
+                <w:color w:val="244061" w:themeColor="accent1" w:themeShade="80"/>
+                <w:sz w:val="20"/>
+                <w:szCs w:val="20"/>
+              </w:rPr>
+            </w:pPr>
+            <w:r>
+              <w:rPr>
+                <w:rFonts w:ascii="Aptos Narrow" w:hAnsi="Aptos Narrow"/>
+                <w:bCs/>
+                <w:color w:val="244061" w:themeColor="accent1" w:themeShade="80"/>
+                <w:sz w:val="20"/>
+                <w:szCs w:val="20"/>
+              </w:rPr>
+              <w:t>Kurzfristige Erfolgsrechnung</w:t>
+            </w:r>
+          </w:p>
+          <w:p>
+            <w:pPr>
+              <w:rPr>
+                <w:rFonts w:ascii="Aptos Narrow" w:hAnsi="Aptos Narrow"/>
+                <w:b/>
+                <w:color w:val="244061" w:themeColor="accent1" w:themeShade="80"/>
+              </w:rPr>
+            </w:pPr>
+            <w:r>
+              <w:rPr>
+                <w:rFonts w:ascii="Aptos Narrow" w:hAnsi="Aptos Narrow"/>
+                <w:bCs/>
+                <w:color w:val="244061" w:themeColor="accent1" w:themeShade="80"/>
+                <w:sz w:val="20"/>
+                <w:szCs w:val="20"/>
+              </w:rPr>
+              <w:t>Break-even</w:t>
+            </w:r>
           </w:p>
         </w:tc>
         <w:tc>
@@ -900,11 +2885,102 @@
                 <w:tab w:val="left" w:pos="989"/>
                 <w:tab w:val="right" w:pos="4533"/>
               </w:tabs>
-              <w:rPr>
-                <w:rFonts w:ascii="Aptos Narrow" w:hAnsi="Aptos Narrow"/>
-                <w:color w:val="215868" w:themeColor="accent5" w:themeShade="80"/>
-              </w:rPr>
-            </w:pPr>
+              <w:spacing w:after="120"/>
+              <w:rPr>
+                <w:rFonts w:ascii="Aptos Narrow" w:hAnsi="Aptos Narrow"/>
+                <w:b/>
+                <w:bCs/>
+                <w:color w:val="215868" w:themeColor="accent5" w:themeShade="80"/>
+              </w:rPr>
+            </w:pPr>
+            <w:r>
+              <w:rPr>
+                <w:rFonts w:ascii="Aptos Narrow" w:hAnsi="Aptos Narrow"/>
+                <w:b/>
+                <w:bCs/>
+                <w:color w:val="215868" w:themeColor="accent5" w:themeShade="80"/>
+              </w:rPr>
+              <w:t>Lernsituation 10.4</w:t>
+            </w:r>
+          </w:p>
+          <w:p>
+            <w:pPr>
+              <w:pStyle w:val="Listenabsatz"/>
+              <w:numPr>
+                <w:ilvl w:val="0"/>
+                <w:numId w:val="1"/>
+              </w:numPr>
+              <w:tabs>
+                <w:tab w:val="left" w:pos="989"/>
+                <w:tab w:val="right" w:pos="4533"/>
+              </w:tabs>
+              <w:rPr>
+                <w:rFonts w:ascii="Aptos Narrow" w:hAnsi="Aptos Narrow"/>
+                <w:color w:val="215868" w:themeColor="accent5" w:themeShade="80"/>
+              </w:rPr>
+            </w:pPr>
+            <w:r>
+              <w:rPr>
+                <w:rFonts w:ascii="Aptos Narrow" w:hAnsi="Aptos Narrow"/>
+                <w:color w:val="215868" w:themeColor="accent5" w:themeShade="80"/>
+              </w:rPr>
+              <w:t>Aufgabenteil 1</w:t>
+            </w:r>
+          </w:p>
+          <w:p>
+            <w:pPr>
+              <w:pStyle w:val="Listenabsatz"/>
+              <w:numPr>
+                <w:ilvl w:val="0"/>
+                <w:numId w:val="1"/>
+              </w:numPr>
+              <w:tabs>
+                <w:tab w:val="left" w:pos="989"/>
+                <w:tab w:val="right" w:pos="4533"/>
+              </w:tabs>
+              <w:rPr>
+                <w:rFonts w:ascii="Aptos Narrow" w:hAnsi="Aptos Narrow"/>
+                <w:color w:val="215868" w:themeColor="accent5" w:themeShade="80"/>
+              </w:rPr>
+            </w:pPr>
+            <w:r>
+              <w:rPr>
+                <w:rFonts w:ascii="Aptos Narrow" w:hAnsi="Aptos Narrow"/>
+                <w:color w:val="215868" w:themeColor="accent5" w:themeShade="80"/>
+              </w:rPr>
+              <w:t>Aufgabenteil 3</w:t>
+            </w:r>
+          </w:p>
+          <w:p>
+            <w:pPr>
+              <w:pStyle w:val="Listenabsatz"/>
+              <w:numPr>
+                <w:ilvl w:val="0"/>
+                <w:numId w:val="1"/>
+              </w:numPr>
+              <w:tabs>
+                <w:tab w:val="left" w:pos="989"/>
+                <w:tab w:val="right" w:pos="4533"/>
+              </w:tabs>
+              <w:rPr>
+                <w:rFonts w:ascii="Aptos Narrow" w:hAnsi="Aptos Narrow"/>
+                <w:color w:val="215868" w:themeColor="accent5" w:themeShade="80"/>
+              </w:rPr>
+            </w:pPr>
+            <w:r>
+              <w:rPr>
+                <w:rFonts w:ascii="Aptos Narrow" w:hAnsi="Aptos Narrow"/>
+                <w:color w:val="215868" w:themeColor="accent5" w:themeShade="80"/>
+              </w:rPr>
+              <w:t>Aufgabenteil 4</w:t>
+            </w:r>
+            <w:r>
+              <w:rPr>
+                <w:rFonts w:ascii="Aptos Narrow" w:hAnsi="Aptos Narrow"/>
+                <w:color w:val="215868" w:themeColor="accent5" w:themeShade="80"/>
+              </w:rPr>
+              <w:t xml:space="preserve"> (ohne vertiefende Aufgaben)</w:t>
+            </w:r>
           </w:p>
         </w:tc>
         <w:tc>
@@ -1058,6 +3134,32 @@
           </w:p>
         </w:tc>
       </w:tr>
+    </w:tbl>
+    <w:p/>
+    <w:p>
+      <w:pPr>
+        <w:spacing w:after="200" w:line="276" w:lineRule="auto"/>
+      </w:pPr>
+      <w:r>
+        <w:br w:type="page"/>
+      </w:r>
+    </w:p>
+    <w:tbl>
+      <w:tblPr>
+        <w:tblStyle w:val="Tabellenraster"/>
+        <w:tblW w:w="5011" w:type="pct"/>
+        <w:tblLayout w:type="fixed"/>
+        <w:tblCellMar>
+          <w:top w:w="57" w:type="dxa"/>
+          <w:left w:w="57" w:type="dxa"/>
+          <w:bottom w:w="57" w:type="dxa"/>
+          <w:right w:w="57" w:type="dxa"/>
+        </w:tblCellMar>
+        <w:tblLook w:val="04A0" w:firstRow="1" w:lastRow="0" w:firstColumn="1" w:lastColumn="0" w:noHBand="0" w:noVBand="1"/>
+      </w:tblPr>
+      <w:tblGrid>
+        <w:gridCol w:w="15729"/>
+      </w:tblGrid>
       <w:tr>
         <w:trPr>
           <w:cantSplit/>
@@ -1065,190 +3167,153 @@
         </w:trPr>
         <w:tc>
           <w:tcPr>
-            <w:tcW w:w="2991" w:type="dxa"/>
-            <w:shd w:val="clear" w:color="auto" w:fill="DBE5F1" w:themeFill="accent1" w:themeFillTint="33"/>
+            <w:tcW w:w="15729" w:type="dxa"/>
+            <w:shd w:val="clear" w:color="auto" w:fill="F2F2F2" w:themeFill="background1" w:themeFillShade="F2"/>
           </w:tcPr>
           <w:p>
             <w:pPr>
-              <w:rPr>
-                <w:rFonts w:ascii="Aptos Narrow" w:hAnsi="Aptos Narrow"/>
-                <w:b/>
-                <w:color w:val="244061" w:themeColor="accent1" w:themeShade="80"/>
-              </w:rPr>
-            </w:pPr>
-          </w:p>
-        </w:tc>
-        <w:tc>
-          <w:tcPr>
-            <w:tcW w:w="6502" w:type="dxa"/>
-          </w:tcPr>
-          <w:p>
-            <w:pPr>
-              <w:tabs>
-                <w:tab w:val="left" w:pos="989"/>
-                <w:tab w:val="right" w:pos="4533"/>
-              </w:tabs>
-              <w:rPr>
-                <w:rFonts w:ascii="Aptos Narrow" w:hAnsi="Aptos Narrow"/>
-                <w:sz w:val="20"/>
-                <w:szCs w:val="20"/>
-              </w:rPr>
-            </w:pPr>
-          </w:p>
-        </w:tc>
-        <w:tc>
-          <w:tcPr>
-            <w:tcW w:w="1559" w:type="dxa"/>
-          </w:tcPr>
-          <w:sdt>
-            <w:sdtPr>
-              <w:rPr>
-                <w:rFonts w:ascii="MS Gothic" w:eastAsia="MS Gothic" w:hAnsi="MS Gothic"/>
-                <w:color w:val="244061" w:themeColor="accent1" w:themeShade="80"/>
-                <w:sz w:val="28"/>
-                <w:szCs w:val="28"/>
-              </w:rPr>
-              <w:id w:val="-1460874850"/>
-              <w14:checkbox>
-                <w14:checked w14:val="0"/>
-                <w14:checkedState w14:val="2612" w14:font="MS Gothic"/>
-                <w14:uncheckedState w14:val="2610" w14:font="MS Gothic"/>
-              </w14:checkbox>
-            </w:sdtPr>
-            <w:sdtEndPr/>
-            <w:sdtContent>
-              <w:p>
-                <w:pPr>
-                  <w:widowControl w:val="0"/>
-                  <w:jc w:val="center"/>
-                  <w:rPr>
-                    <w:rFonts w:ascii="MS Gothic" w:eastAsia="MS Gothic" w:hAnsi="MS Gothic"/>
-                    <w:color w:val="244061" w:themeColor="accent1" w:themeShade="80"/>
-                    <w:sz w:val="28"/>
-                    <w:szCs w:val="28"/>
-                  </w:rPr>
-                </w:pPr>
-                <w:r>
-                  <w:rPr>
-                    <w:rFonts w:ascii="MS Gothic" w:eastAsia="MS Gothic" w:hAnsi="MS Gothic"/>
-                    <w:color w:val="244061" w:themeColor="accent1" w:themeShade="80"/>
-                    <w:sz w:val="28"/>
-                    <w:szCs w:val="28"/>
-                  </w:rPr>
-                  <w:t>☐</w:t>
-                </w:r>
-              </w:p>
-            </w:sdtContent>
-          </w:sdt>
-        </w:tc>
-        <w:tc>
-          <w:tcPr>
-            <w:tcW w:w="1559" w:type="dxa"/>
-          </w:tcPr>
-          <w:sdt>
-            <w:sdtPr>
-              <w:rPr>
-                <w:rFonts w:ascii="MS Gothic" w:eastAsia="MS Gothic" w:hAnsi="MS Gothic"/>
-                <w:color w:val="244061" w:themeColor="accent1" w:themeShade="80"/>
-                <w:sz w:val="28"/>
-                <w:szCs w:val="28"/>
-              </w:rPr>
-              <w:id w:val="1018852"/>
-              <w14:checkbox>
-                <w14:checked w14:val="0"/>
-                <w14:checkedState w14:val="2612" w14:font="MS Gothic"/>
-                <w14:uncheckedState w14:val="2610" w14:font="MS Gothic"/>
-              </w14:checkbox>
-            </w:sdtPr>
-            <w:sdtEndPr/>
-            <w:sdtContent>
-              <w:p>
-                <w:pPr>
-                  <w:widowControl w:val="0"/>
-                  <w:jc w:val="center"/>
-                  <w:rPr>
-                    <w:rFonts w:ascii="MS Gothic" w:eastAsia="MS Gothic" w:hAnsi="MS Gothic"/>
-                    <w:color w:val="244061" w:themeColor="accent1" w:themeShade="80"/>
-                    <w:sz w:val="28"/>
-                    <w:szCs w:val="28"/>
-                  </w:rPr>
-                </w:pPr>
-                <w:r>
-                  <w:rPr>
-                    <w:rFonts w:ascii="MS Gothic" w:eastAsia="MS Gothic" w:hAnsi="MS Gothic"/>
-                    <w:color w:val="244061" w:themeColor="accent1" w:themeShade="80"/>
-                    <w:sz w:val="28"/>
-                    <w:szCs w:val="28"/>
-                  </w:rPr>
-                  <w:t>☐</w:t>
-                </w:r>
-              </w:p>
-            </w:sdtContent>
-          </w:sdt>
-        </w:tc>
-        <w:tc>
-          <w:tcPr>
-            <w:tcW w:w="1559" w:type="dxa"/>
-          </w:tcPr>
-          <w:sdt>
-            <w:sdtPr>
-              <w:rPr>
-                <w:rFonts w:ascii="MS Gothic" w:eastAsia="MS Gothic" w:hAnsi="MS Gothic"/>
-                <w:color w:val="244061" w:themeColor="accent1" w:themeShade="80"/>
-                <w:sz w:val="28"/>
-                <w:szCs w:val="28"/>
-              </w:rPr>
-              <w:id w:val="412899013"/>
-              <w14:checkbox>
-                <w14:checked w14:val="0"/>
-                <w14:checkedState w14:val="2612" w14:font="MS Gothic"/>
-                <w14:uncheckedState w14:val="2610" w14:font="MS Gothic"/>
-              </w14:checkbox>
-            </w:sdtPr>
-            <w:sdtEndPr/>
-            <w:sdtContent>
-              <w:p>
-                <w:pPr>
-                  <w:jc w:val="center"/>
-                  <w:rPr>
-                    <w:rFonts w:ascii="MS Gothic" w:eastAsia="MS Gothic" w:hAnsi="MS Gothic"/>
-                    <w:color w:val="244061" w:themeColor="accent1" w:themeShade="80"/>
-                    <w:sz w:val="28"/>
-                    <w:szCs w:val="28"/>
-                  </w:rPr>
-                </w:pPr>
-                <w:r>
-                  <w:rPr>
-                    <w:rFonts w:ascii="MS Gothic" w:eastAsia="MS Gothic" w:hAnsi="MS Gothic"/>
-                    <w:color w:val="244061" w:themeColor="accent1" w:themeShade="80"/>
-                    <w:sz w:val="28"/>
-                    <w:szCs w:val="28"/>
-                  </w:rPr>
-                  <w:t>☐</w:t>
-                </w:r>
-              </w:p>
-            </w:sdtContent>
-          </w:sdt>
-        </w:tc>
-        <w:tc>
-          <w:tcPr>
-            <w:tcW w:w="1559" w:type="dxa"/>
-          </w:tcPr>
-          <w:p>
-            <w:pPr>
-              <w:jc w:val="center"/>
-              <w:rPr>
-                <w:rFonts w:ascii="MS Gothic" w:eastAsia="MS Gothic" w:hAnsi="MS Gothic"/>
-                <w:color w:val="244061" w:themeColor="accent1" w:themeShade="80"/>
-                <w:sz w:val="28"/>
-                <w:szCs w:val="28"/>
-              </w:rPr>
-            </w:pPr>
+              <w:spacing w:after="120"/>
+              <w:rPr>
+                <w:rFonts w:ascii="Aptos Narrow" w:hAnsi="Aptos Narrow"/>
+                <w:b/>
+                <w:color w:val="262626" w:themeColor="text1" w:themeTint="D9"/>
+              </w:rPr>
+            </w:pPr>
+            <w:r>
+              <w:rPr>
+                <w:rFonts w:ascii="Aptos Narrow" w:hAnsi="Aptos Narrow"/>
+                <w:b/>
+                <w:color w:val="262626" w:themeColor="text1" w:themeTint="D9"/>
+              </w:rPr>
+              <w:lastRenderedPageBreak/>
+              <w:t>Prozess</w:t>
+            </w:r>
+            <w:r>
+              <w:rPr>
+                <w:rFonts w:ascii="Aptos Narrow" w:hAnsi="Aptos Narrow"/>
+                <w:b/>
+                <w:color w:val="262626" w:themeColor="text1" w:themeTint="D9"/>
+              </w:rPr>
+              <w:t>kostenrechnung</w:t>
+            </w:r>
+          </w:p>
+          <w:p>
+            <w:pPr>
+              <w:autoSpaceDE w:val="0"/>
+              <w:autoSpaceDN w:val="0"/>
+              <w:adjustRightInd w:val="0"/>
+              <w:spacing w:line="240" w:lineRule="auto"/>
+              <w:rPr>
+                <w:rFonts w:ascii="Aptos Narrow" w:eastAsia="MS Gothic" w:hAnsi="Aptos Narrow"/>
+                <w:color w:val="262626" w:themeColor="text1" w:themeTint="D9"/>
+                <w:sz w:val="20"/>
+                <w:szCs w:val="20"/>
+              </w:rPr>
+            </w:pPr>
+            <w:r>
+              <w:rPr>
+                <w:rFonts w:ascii="Aptos Narrow" w:hAnsi="Aptos Narrow" w:cs="GlyphLessFont"/>
+                <w:color w:val="262626" w:themeColor="text1" w:themeTint="D9"/>
+                <w:sz w:val="20"/>
+                <w:szCs w:val="20"/>
+              </w:rPr>
+              <w:t>Die Prozesskostenrechnung ist eine moderne Form der Vollkostenrechnung. Dabei werden die Kosten nicht einfach pauschal verteilt, sondern den einzelnen Prozessen zugeordnet, die im Unternehmen tatsächlich ablaufen. So passt die Kostenrechnung besser zu Unternehmen, die in Prozessen denken und arbeiten.</w:t>
+            </w:r>
           </w:p>
         </w:tc>
       </w:tr>
     </w:tbl>
     <w:p/>
+    <w:tbl>
+      <w:tblPr>
+        <w:tblStyle w:val="Tabellenraster"/>
+        <w:tblW w:w="5011" w:type="pct"/>
+        <w:tblLayout w:type="fixed"/>
+        <w:tblCellMar>
+          <w:top w:w="57" w:type="dxa"/>
+          <w:left w:w="57" w:type="dxa"/>
+          <w:bottom w:w="57" w:type="dxa"/>
+          <w:right w:w="57" w:type="dxa"/>
+        </w:tblCellMar>
+        <w:tblLook w:val="04A0" w:firstRow="1" w:lastRow="0" w:firstColumn="1" w:lastColumn="0" w:noHBand="0" w:noVBand="1"/>
+      </w:tblPr>
+      <w:tblGrid>
+        <w:gridCol w:w="15729"/>
+      </w:tblGrid>
+      <w:tr>
+        <w:trPr>
+          <w:cantSplit/>
+          <w:trHeight w:val="964"/>
+        </w:trPr>
+        <w:tc>
+          <w:tcPr>
+            <w:tcW w:w="15729" w:type="dxa"/>
+            <w:shd w:val="clear" w:color="auto" w:fill="F2F2F2" w:themeFill="background1" w:themeFillShade="F2"/>
+          </w:tcPr>
+          <w:p>
+            <w:pPr>
+              <w:spacing w:after="120"/>
+              <w:rPr>
+                <w:rFonts w:ascii="Aptos Narrow" w:hAnsi="Aptos Narrow"/>
+                <w:b/>
+                <w:color w:val="262626" w:themeColor="text1" w:themeTint="D9"/>
+              </w:rPr>
+            </w:pPr>
+            <w:r>
+              <w:rPr>
+                <w:rFonts w:ascii="Aptos Narrow" w:hAnsi="Aptos Narrow"/>
+                <w:b/>
+                <w:color w:val="262626" w:themeColor="text1" w:themeTint="D9"/>
+              </w:rPr>
+              <w:t>Controlling</w:t>
+            </w:r>
+          </w:p>
+          <w:p>
+            <w:pPr>
+              <w:autoSpaceDE w:val="0"/>
+              <w:autoSpaceDN w:val="0"/>
+              <w:adjustRightInd w:val="0"/>
+              <w:spacing w:line="240" w:lineRule="auto"/>
+              <w:rPr>
+                <w:rFonts w:ascii="Aptos Narrow" w:eastAsia="MS Gothic" w:hAnsi="Aptos Narrow"/>
+                <w:color w:val="262626" w:themeColor="text1" w:themeTint="D9"/>
+                <w:sz w:val="20"/>
+                <w:szCs w:val="20"/>
+              </w:rPr>
+            </w:pPr>
+            <w:r>
+              <w:rPr>
+                <w:rFonts w:ascii="Aptos Narrow" w:hAnsi="Aptos Narrow" w:cs="GlyphLessFont"/>
+                <w:color w:val="262626" w:themeColor="text1" w:themeTint="D9"/>
+                <w:sz w:val="20"/>
+                <w:szCs w:val="20"/>
+              </w:rPr>
+              <w:t>Das Controlling nutzt die verschiedenen Kostenrechnungssysteme, um den Leistungsprozess eines Unternehmens zu planen, zu steuern und zu überwachen. Mit der Plankostenrechnung kann man Soll</w:t>
+            </w:r>
+            <w:r>
+              <w:rPr>
+                <w:rFonts w:ascii="Aptos Narrow" w:hAnsi="Aptos Narrow" w:cs="GlyphLessFont"/>
+                <w:color w:val="262626" w:themeColor="text1" w:themeTint="D9"/>
+                <w:sz w:val="20"/>
+                <w:szCs w:val="20"/>
+              </w:rPr>
+              <w:noBreakHyphen/>
+              <w:t>Ist</w:t>
+            </w:r>
+            <w:r>
+              <w:rPr>
+                <w:rFonts w:ascii="Aptos Narrow" w:hAnsi="Aptos Narrow" w:cs="GlyphLessFont"/>
+                <w:color w:val="262626" w:themeColor="text1" w:themeTint="D9"/>
+                <w:sz w:val="20"/>
+                <w:szCs w:val="20"/>
+              </w:rPr>
+              <w:noBreakHyphen/>
+              <w:t>Vergleiche durchführen. Weichen die tatsächlichen Werte von den geplanten ab, zeigt die anschließende Abweichungsanalyse, wo Probleme oder Chancen liegen – und liefert damit wichtige Informationen für die Unternehmensführung.</w:t>
+            </w:r>
+          </w:p>
+        </w:tc>
+      </w:tr>
+    </w:tbl>
     <w:p>
       <w:pPr>
         <w:spacing w:line="276" w:lineRule="auto"/>
@@ -1256,8 +3321,8 @@
     </w:p>
     <w:p/>
     <w:sectPr>
-      <w:headerReference w:type="default" r:id="rId7"/>
-      <w:footerReference w:type="default" r:id="rId8"/>
+      <w:headerReference w:type="default" r:id="rId8"/>
+      <w:footerReference w:type="default" r:id="rId9"/>
       <w:pgSz w:w="16838" w:h="11906" w:orient="landscape" w:code="9"/>
       <w:pgMar w:top="1418" w:right="567" w:bottom="397" w:left="567" w:header="851" w:footer="397" w:gutter="0"/>
       <w:cols w:space="708"/>
@@ -1892,6 +3957,475 @@
     </w:pPr>
   </w:p>
 </w:hdr>
+</file>
+
+<file path=word/numbering.xml><?xml version="1.0" encoding="utf-8"?>
+<w:numbering xmlns:wpc="http://schemas.microsoft.com/office/word/2010/wordprocessingCanvas" xmlns:cx="http://schemas.microsoft.com/office/drawing/2014/chartex" xmlns:cx1="http://schemas.microsoft.com/office/drawing/2015/9/8/chartex" xmlns:cx2="http://schemas.microsoft.com/office/drawing/2015/10/21/chartex" xmlns:cx3="http://schemas.microsoft.com/office/drawing/2016/5/9/chartex" xmlns:cx4="http://schemas.microsoft.com/office/drawing/2016/5/10/chartex" xmlns:cx5="http://schemas.microsoft.com/office/drawing/2016/5/11/chartex" xmlns:cx6="http://schemas.microsoft.com/office/drawing/2016/5/12/chartex" xmlns:cx7="http://schemas.microsoft.com/office/drawing/2016/5/13/chartex" xmlns:cx8="http://schemas.microsoft.com/office/drawing/2016/5/14/chartex" xmlns:mc="http://schemas.openxmlformats.org/markup-compatibility/2006" xmlns:aink="http://schemas.microsoft.com/office/drawing/2016/ink" xmlns:am3d="http://schemas.microsoft.com/office/drawing/2017/model3d" xmlns:o="urn:schemas-microsoft-com:office:office" xmlns:oel="http://schemas.microsoft.com/office/2019/extlst" xmlns:r="http://schemas.openxmlformats.org/officeDocument/2006/relationships" xmlns:m="http://schemas.openxmlformats.org/officeDocument/2006/math" xmlns:v="urn:schemas-microsoft-com:vml" xmlns:wp14="http://schemas.microsoft.com/office/word/2010/wordprocessingDrawing" xmlns:wp="http://schemas.openxmlformats.org/drawingml/2006/wordprocessingDrawing" xmlns:w10="urn:schemas-microsoft-com:office:word" xmlns:w="http://schemas.openxmlformats.org/wordprocessingml/2006/main" xmlns:w14="http://schemas.microsoft.com/office/word/2010/wordml" xmlns:w15="http://schemas.microsoft.com/office/word/2012/wordml" xmlns:w16cex="http://schemas.microsoft.com/office/word/2018/wordml/cex" xmlns:w16cid="http://schemas.microsoft.com/office/word/2016/wordml/cid" xmlns:w16="http://schemas.microsoft.com/office/word/2018/wordml" xmlns:w16du="http://schemas.microsoft.com/office/word/2023/wordml/word16du" xmlns:w16sdtdh="http://schemas.microsoft.com/office/word/2020/wordml/sdtdatahash" xmlns:w16sdtfl="http://schemas.microsoft.com/office/word/2024/wordml/sdtformatlock" xmlns:w16se="http://schemas.microsoft.com/office/word/2015/wordml/symex" xmlns:wpg="http://schemas.microsoft.com/office/word/2010/wordprocessingGroup" xmlns:wpi="http://schemas.microsoft.com/office/word/2010/wordprocessingInk" xmlns:wne="http://schemas.microsoft.com/office/word/2006/wordml" xmlns:wps="http://schemas.microsoft.com/office/word/2010/wordprocessingShape" mc:Ignorable="w14 w15 w16se w16cid w16 w16cex w16sdtdh w16sdtfl w16du wp14">
+  <w:abstractNum w:abstractNumId="0" w15:restartNumberingAfterBreak="0">
+    <w:nsid w:val="111503D1"/>
+    <w:multiLevelType w:val="hybridMultilevel"/>
+    <w:tmpl w:val="536A754C"/>
+    <w:lvl w:ilvl="0" w:tplc="04070001">
+      <w:start w:val="1"/>
+      <w:numFmt w:val="bullet"/>
+      <w:lvlText w:val=""/>
+      <w:lvlJc w:val="left"/>
+      <w:pPr>
+        <w:ind w:left="360" w:hanging="360"/>
+      </w:pPr>
+      <w:rPr>
+        <w:rFonts w:ascii="Symbol" w:hAnsi="Symbol" w:hint="default"/>
+      </w:rPr>
+    </w:lvl>
+    <w:lvl w:ilvl="1" w:tplc="04070003" w:tentative="1">
+      <w:start w:val="1"/>
+      <w:numFmt w:val="bullet"/>
+      <w:lvlText w:val="o"/>
+      <w:lvlJc w:val="left"/>
+      <w:pPr>
+        <w:ind w:left="1080" w:hanging="360"/>
+      </w:pPr>
+      <w:rPr>
+        <w:rFonts w:ascii="Courier New" w:hAnsi="Courier New" w:cs="Courier New" w:hint="default"/>
+      </w:rPr>
+    </w:lvl>
+    <w:lvl w:ilvl="2" w:tplc="04070005" w:tentative="1">
+      <w:start w:val="1"/>
+      <w:numFmt w:val="bullet"/>
+      <w:lvlText w:val=""/>
+      <w:lvlJc w:val="left"/>
+      <w:pPr>
+        <w:ind w:left="1800" w:hanging="360"/>
+      </w:pPr>
+      <w:rPr>
+        <w:rFonts w:ascii="Wingdings" w:hAnsi="Wingdings" w:hint="default"/>
+      </w:rPr>
+    </w:lvl>
+    <w:lvl w:ilvl="3" w:tplc="04070001" w:tentative="1">
+      <w:start w:val="1"/>
+      <w:numFmt w:val="bullet"/>
+      <w:lvlText w:val=""/>
+      <w:lvlJc w:val="left"/>
+      <w:pPr>
+        <w:ind w:left="2520" w:hanging="360"/>
+      </w:pPr>
+      <w:rPr>
+        <w:rFonts w:ascii="Symbol" w:hAnsi="Symbol" w:hint="default"/>
+      </w:rPr>
+    </w:lvl>
+    <w:lvl w:ilvl="4" w:tplc="04070003" w:tentative="1">
+      <w:start w:val="1"/>
+      <w:numFmt w:val="bullet"/>
+      <w:lvlText w:val="o"/>
+      <w:lvlJc w:val="left"/>
+      <w:pPr>
+        <w:ind w:left="3240" w:hanging="360"/>
+      </w:pPr>
+      <w:rPr>
+        <w:rFonts w:ascii="Courier New" w:hAnsi="Courier New" w:cs="Courier New" w:hint="default"/>
+      </w:rPr>
+    </w:lvl>
+    <w:lvl w:ilvl="5" w:tplc="04070005" w:tentative="1">
+      <w:start w:val="1"/>
+      <w:numFmt w:val="bullet"/>
+      <w:lvlText w:val=""/>
+      <w:lvlJc w:val="left"/>
+      <w:pPr>
+        <w:ind w:left="3960" w:hanging="360"/>
+      </w:pPr>
+      <w:rPr>
+        <w:rFonts w:ascii="Wingdings" w:hAnsi="Wingdings" w:hint="default"/>
+      </w:rPr>
+    </w:lvl>
+    <w:lvl w:ilvl="6" w:tplc="04070001" w:tentative="1">
+      <w:start w:val="1"/>
+      <w:numFmt w:val="bullet"/>
+      <w:lvlText w:val=""/>
+      <w:lvlJc w:val="left"/>
+      <w:pPr>
+        <w:ind w:left="4680" w:hanging="360"/>
+      </w:pPr>
+      <w:rPr>
+        <w:rFonts w:ascii="Symbol" w:hAnsi="Symbol" w:hint="default"/>
+      </w:rPr>
+    </w:lvl>
+    <w:lvl w:ilvl="7" w:tplc="04070003" w:tentative="1">
+      <w:start w:val="1"/>
+      <w:numFmt w:val="bullet"/>
+      <w:lvlText w:val="o"/>
+      <w:lvlJc w:val="left"/>
+      <w:pPr>
+        <w:ind w:left="5400" w:hanging="360"/>
+      </w:pPr>
+      <w:rPr>
+        <w:rFonts w:ascii="Courier New" w:hAnsi="Courier New" w:cs="Courier New" w:hint="default"/>
+      </w:rPr>
+    </w:lvl>
+    <w:lvl w:ilvl="8" w:tplc="04070005" w:tentative="1">
+      <w:start w:val="1"/>
+      <w:numFmt w:val="bullet"/>
+      <w:lvlText w:val=""/>
+      <w:lvlJc w:val="left"/>
+      <w:pPr>
+        <w:ind w:left="6120" w:hanging="360"/>
+      </w:pPr>
+      <w:rPr>
+        <w:rFonts w:ascii="Wingdings" w:hAnsi="Wingdings" w:hint="default"/>
+      </w:rPr>
+    </w:lvl>
+  </w:abstractNum>
+  <w:abstractNum w:abstractNumId="1" w15:restartNumberingAfterBreak="0">
+    <w:nsid w:val="1A7C4ABD"/>
+    <w:multiLevelType w:val="hybridMultilevel"/>
+    <w:tmpl w:val="FF6EBA8A"/>
+    <w:lvl w:ilvl="0" w:tplc="04070001">
+      <w:start w:val="1"/>
+      <w:numFmt w:val="bullet"/>
+      <w:lvlText w:val=""/>
+      <w:lvlJc w:val="left"/>
+      <w:pPr>
+        <w:ind w:left="360" w:hanging="360"/>
+      </w:pPr>
+      <w:rPr>
+        <w:rFonts w:ascii="Symbol" w:hAnsi="Symbol" w:hint="default"/>
+      </w:rPr>
+    </w:lvl>
+    <w:lvl w:ilvl="1" w:tplc="04070003" w:tentative="1">
+      <w:start w:val="1"/>
+      <w:numFmt w:val="bullet"/>
+      <w:lvlText w:val="o"/>
+      <w:lvlJc w:val="left"/>
+      <w:pPr>
+        <w:ind w:left="1080" w:hanging="360"/>
+      </w:pPr>
+      <w:rPr>
+        <w:rFonts w:ascii="Courier New" w:hAnsi="Courier New" w:cs="Courier New" w:hint="default"/>
+      </w:rPr>
+    </w:lvl>
+    <w:lvl w:ilvl="2" w:tplc="04070005" w:tentative="1">
+      <w:start w:val="1"/>
+      <w:numFmt w:val="bullet"/>
+      <w:lvlText w:val=""/>
+      <w:lvlJc w:val="left"/>
+      <w:pPr>
+        <w:ind w:left="1800" w:hanging="360"/>
+      </w:pPr>
+      <w:rPr>
+        <w:rFonts w:ascii="Wingdings" w:hAnsi="Wingdings" w:hint="default"/>
+      </w:rPr>
+    </w:lvl>
+    <w:lvl w:ilvl="3" w:tplc="04070001" w:tentative="1">
+      <w:start w:val="1"/>
+      <w:numFmt w:val="bullet"/>
+      <w:lvlText w:val=""/>
+      <w:lvlJc w:val="left"/>
+      <w:pPr>
+        <w:ind w:left="2520" w:hanging="360"/>
+      </w:pPr>
+      <w:rPr>
+        <w:rFonts w:ascii="Symbol" w:hAnsi="Symbol" w:hint="default"/>
+      </w:rPr>
+    </w:lvl>
+    <w:lvl w:ilvl="4" w:tplc="04070003" w:tentative="1">
+      <w:start w:val="1"/>
+      <w:numFmt w:val="bullet"/>
+      <w:lvlText w:val="o"/>
+      <w:lvlJc w:val="left"/>
+      <w:pPr>
+        <w:ind w:left="3240" w:hanging="360"/>
+      </w:pPr>
+      <w:rPr>
+        <w:rFonts w:ascii="Courier New" w:hAnsi="Courier New" w:cs="Courier New" w:hint="default"/>
+      </w:rPr>
+    </w:lvl>
+    <w:lvl w:ilvl="5" w:tplc="04070005" w:tentative="1">
+      <w:start w:val="1"/>
+      <w:numFmt w:val="bullet"/>
+      <w:lvlText w:val=""/>
+      <w:lvlJc w:val="left"/>
+      <w:pPr>
+        <w:ind w:left="3960" w:hanging="360"/>
+      </w:pPr>
+      <w:rPr>
+        <w:rFonts w:ascii="Wingdings" w:hAnsi="Wingdings" w:hint="default"/>
+      </w:rPr>
+    </w:lvl>
+    <w:lvl w:ilvl="6" w:tplc="04070001" w:tentative="1">
+      <w:start w:val="1"/>
+      <w:numFmt w:val="bullet"/>
+      <w:lvlText w:val=""/>
+      <w:lvlJc w:val="left"/>
+      <w:pPr>
+        <w:ind w:left="4680" w:hanging="360"/>
+      </w:pPr>
+      <w:rPr>
+        <w:rFonts w:ascii="Symbol" w:hAnsi="Symbol" w:hint="default"/>
+      </w:rPr>
+    </w:lvl>
+    <w:lvl w:ilvl="7" w:tplc="04070003" w:tentative="1">
+      <w:start w:val="1"/>
+      <w:numFmt w:val="bullet"/>
+      <w:lvlText w:val="o"/>
+      <w:lvlJc w:val="left"/>
+      <w:pPr>
+        <w:ind w:left="5400" w:hanging="360"/>
+      </w:pPr>
+      <w:rPr>
+        <w:rFonts w:ascii="Courier New" w:hAnsi="Courier New" w:cs="Courier New" w:hint="default"/>
+      </w:rPr>
+    </w:lvl>
+    <w:lvl w:ilvl="8" w:tplc="04070005" w:tentative="1">
+      <w:start w:val="1"/>
+      <w:numFmt w:val="bullet"/>
+      <w:lvlText w:val=""/>
+      <w:lvlJc w:val="left"/>
+      <w:pPr>
+        <w:ind w:left="6120" w:hanging="360"/>
+      </w:pPr>
+      <w:rPr>
+        <w:rFonts w:ascii="Wingdings" w:hAnsi="Wingdings" w:hint="default"/>
+      </w:rPr>
+    </w:lvl>
+  </w:abstractNum>
+  <w:abstractNum w:abstractNumId="2" w15:restartNumberingAfterBreak="0">
+    <w:nsid w:val="2973487B"/>
+    <w:multiLevelType w:val="hybridMultilevel"/>
+    <w:tmpl w:val="ABC08368"/>
+    <w:lvl w:ilvl="0" w:tplc="09682554">
+      <w:start w:val="1"/>
+      <w:numFmt w:val="bullet"/>
+      <w:lvlText w:val=""/>
+      <w:lvlJc w:val="left"/>
+      <w:pPr>
+        <w:ind w:left="360" w:hanging="360"/>
+      </w:pPr>
+      <w:rPr>
+        <w:rFonts w:ascii="Symbol" w:hAnsi="Symbol" w:hint="default"/>
+      </w:rPr>
+    </w:lvl>
+    <w:lvl w:ilvl="1" w:tplc="04070003" w:tentative="1">
+      <w:start w:val="1"/>
+      <w:numFmt w:val="bullet"/>
+      <w:lvlText w:val="o"/>
+      <w:lvlJc w:val="left"/>
+      <w:pPr>
+        <w:ind w:left="1080" w:hanging="360"/>
+      </w:pPr>
+      <w:rPr>
+        <w:rFonts w:ascii="Courier New" w:hAnsi="Courier New" w:cs="Courier New" w:hint="default"/>
+      </w:rPr>
+    </w:lvl>
+    <w:lvl w:ilvl="2" w:tplc="04070005" w:tentative="1">
+      <w:start w:val="1"/>
+      <w:numFmt w:val="bullet"/>
+      <w:lvlText w:val=""/>
+      <w:lvlJc w:val="left"/>
+      <w:pPr>
+        <w:ind w:left="1800" w:hanging="360"/>
+      </w:pPr>
+      <w:rPr>
+        <w:rFonts w:ascii="Wingdings" w:hAnsi="Wingdings" w:hint="default"/>
+      </w:rPr>
+    </w:lvl>
+    <w:lvl w:ilvl="3" w:tplc="04070001" w:tentative="1">
+      <w:start w:val="1"/>
+      <w:numFmt w:val="bullet"/>
+      <w:lvlText w:val=""/>
+      <w:lvlJc w:val="left"/>
+      <w:pPr>
+        <w:ind w:left="2520" w:hanging="360"/>
+      </w:pPr>
+      <w:rPr>
+        <w:rFonts w:ascii="Symbol" w:hAnsi="Symbol" w:hint="default"/>
+      </w:rPr>
+    </w:lvl>
+    <w:lvl w:ilvl="4" w:tplc="04070003" w:tentative="1">
+      <w:start w:val="1"/>
+      <w:numFmt w:val="bullet"/>
+      <w:lvlText w:val="o"/>
+      <w:lvlJc w:val="left"/>
+      <w:pPr>
+        <w:ind w:left="3240" w:hanging="360"/>
+      </w:pPr>
+      <w:rPr>
+        <w:rFonts w:ascii="Courier New" w:hAnsi="Courier New" w:cs="Courier New" w:hint="default"/>
+      </w:rPr>
+    </w:lvl>
+    <w:lvl w:ilvl="5" w:tplc="04070005" w:tentative="1">
+      <w:start w:val="1"/>
+      <w:numFmt w:val="bullet"/>
+      <w:lvlText w:val=""/>
+      <w:lvlJc w:val="left"/>
+      <w:pPr>
+        <w:ind w:left="3960" w:hanging="360"/>
+      </w:pPr>
+      <w:rPr>
+        <w:rFonts w:ascii="Wingdings" w:hAnsi="Wingdings" w:hint="default"/>
+      </w:rPr>
+    </w:lvl>
+    <w:lvl w:ilvl="6" w:tplc="04070001" w:tentative="1">
+      <w:start w:val="1"/>
+      <w:numFmt w:val="bullet"/>
+      <w:lvlText w:val=""/>
+      <w:lvlJc w:val="left"/>
+      <w:pPr>
+        <w:ind w:left="4680" w:hanging="360"/>
+      </w:pPr>
+      <w:rPr>
+        <w:rFonts w:ascii="Symbol" w:hAnsi="Symbol" w:hint="default"/>
+      </w:rPr>
+    </w:lvl>
+    <w:lvl w:ilvl="7" w:tplc="04070003" w:tentative="1">
+      <w:start w:val="1"/>
+      <w:numFmt w:val="bullet"/>
+      <w:lvlText w:val="o"/>
+      <w:lvlJc w:val="left"/>
+      <w:pPr>
+        <w:ind w:left="5400" w:hanging="360"/>
+      </w:pPr>
+      <w:rPr>
+        <w:rFonts w:ascii="Courier New" w:hAnsi="Courier New" w:cs="Courier New" w:hint="default"/>
+      </w:rPr>
+    </w:lvl>
+    <w:lvl w:ilvl="8" w:tplc="04070005" w:tentative="1">
+      <w:start w:val="1"/>
+      <w:numFmt w:val="bullet"/>
+      <w:lvlText w:val=""/>
+      <w:lvlJc w:val="left"/>
+      <w:pPr>
+        <w:ind w:left="6120" w:hanging="360"/>
+      </w:pPr>
+      <w:rPr>
+        <w:rFonts w:ascii="Wingdings" w:hAnsi="Wingdings" w:hint="default"/>
+      </w:rPr>
+    </w:lvl>
+  </w:abstractNum>
+  <w:abstractNum w:abstractNumId="3" w15:restartNumberingAfterBreak="0">
+    <w:nsid w:val="4BFB15A6"/>
+    <w:multiLevelType w:val="hybridMultilevel"/>
+    <w:tmpl w:val="79DC69D0"/>
+    <w:lvl w:ilvl="0" w:tplc="04070001">
+      <w:start w:val="1"/>
+      <w:numFmt w:val="bullet"/>
+      <w:lvlText w:val=""/>
+      <w:lvlJc w:val="left"/>
+      <w:pPr>
+        <w:ind w:left="360" w:hanging="360"/>
+      </w:pPr>
+      <w:rPr>
+        <w:rFonts w:ascii="Symbol" w:hAnsi="Symbol" w:hint="default"/>
+      </w:rPr>
+    </w:lvl>
+    <w:lvl w:ilvl="1" w:tplc="04070003" w:tentative="1">
+      <w:start w:val="1"/>
+      <w:numFmt w:val="bullet"/>
+      <w:lvlText w:val="o"/>
+      <w:lvlJc w:val="left"/>
+      <w:pPr>
+        <w:ind w:left="1080" w:hanging="360"/>
+      </w:pPr>
+      <w:rPr>
+        <w:rFonts w:ascii="Courier New" w:hAnsi="Courier New" w:cs="Courier New" w:hint="default"/>
+      </w:rPr>
+    </w:lvl>
+    <w:lvl w:ilvl="2" w:tplc="04070005" w:tentative="1">
+      <w:start w:val="1"/>
+      <w:numFmt w:val="bullet"/>
+      <w:lvlText w:val=""/>
+      <w:lvlJc w:val="left"/>
+      <w:pPr>
+        <w:ind w:left="1800" w:hanging="360"/>
+      </w:pPr>
+      <w:rPr>
+        <w:rFonts w:ascii="Wingdings" w:hAnsi="Wingdings" w:hint="default"/>
+      </w:rPr>
+    </w:lvl>
+    <w:lvl w:ilvl="3" w:tplc="04070001" w:tentative="1">
+      <w:start w:val="1"/>
+      <w:numFmt w:val="bullet"/>
+      <w:lvlText w:val=""/>
+      <w:lvlJc w:val="left"/>
+      <w:pPr>
+        <w:ind w:left="2520" w:hanging="360"/>
+      </w:pPr>
+      <w:rPr>
+        <w:rFonts w:ascii="Symbol" w:hAnsi="Symbol" w:hint="default"/>
+      </w:rPr>
+    </w:lvl>
+    <w:lvl w:ilvl="4" w:tplc="04070003" w:tentative="1">
+      <w:start w:val="1"/>
+      <w:numFmt w:val="bullet"/>
+      <w:lvlText w:val="o"/>
+      <w:lvlJc w:val="left"/>
+      <w:pPr>
+        <w:ind w:left="3240" w:hanging="360"/>
+      </w:pPr>
+      <w:rPr>
+        <w:rFonts w:ascii="Courier New" w:hAnsi="Courier New" w:cs="Courier New" w:hint="default"/>
+      </w:rPr>
+    </w:lvl>
+    <w:lvl w:ilvl="5" w:tplc="04070005" w:tentative="1">
+      <w:start w:val="1"/>
+      <w:numFmt w:val="bullet"/>
+      <w:lvlText w:val=""/>
+      <w:lvlJc w:val="left"/>
+      <w:pPr>
+        <w:ind w:left="3960" w:hanging="360"/>
+      </w:pPr>
+      <w:rPr>
+        <w:rFonts w:ascii="Wingdings" w:hAnsi="Wingdings" w:hint="default"/>
+      </w:rPr>
+    </w:lvl>
+    <w:lvl w:ilvl="6" w:tplc="04070001" w:tentative="1">
+      <w:start w:val="1"/>
+      <w:numFmt w:val="bullet"/>
+      <w:lvlText w:val=""/>
+      <w:lvlJc w:val="left"/>
+      <w:pPr>
+        <w:ind w:left="4680" w:hanging="360"/>
+      </w:pPr>
+      <w:rPr>
+        <w:rFonts w:ascii="Symbol" w:hAnsi="Symbol" w:hint="default"/>
+      </w:rPr>
+    </w:lvl>
+    <w:lvl w:ilvl="7" w:tplc="04070003" w:tentative="1">
+      <w:start w:val="1"/>
+      <w:numFmt w:val="bullet"/>
+      <w:lvlText w:val="o"/>
+      <w:lvlJc w:val="left"/>
+      <w:pPr>
+        <w:ind w:left="5400" w:hanging="360"/>
+      </w:pPr>
+      <w:rPr>
+        <w:rFonts w:ascii="Courier New" w:hAnsi="Courier New" w:cs="Courier New" w:hint="default"/>
+      </w:rPr>
+    </w:lvl>
+    <w:lvl w:ilvl="8" w:tplc="04070005" w:tentative="1">
+      <w:start w:val="1"/>
+      <w:numFmt w:val="bullet"/>
+      <w:lvlText w:val=""/>
+      <w:lvlJc w:val="left"/>
+      <w:pPr>
+        <w:ind w:left="6120" w:hanging="360"/>
+      </w:pPr>
+      <w:rPr>
+        <w:rFonts w:ascii="Wingdings" w:hAnsi="Wingdings" w:hint="default"/>
+      </w:rPr>
+    </w:lvl>
+  </w:abstractNum>
+  <w:num w:numId="1" w16cid:durableId="1873420904">
+    <w:abstractNumId w:val="2"/>
+  </w:num>
+  <w:num w:numId="2" w16cid:durableId="1821925417">
+    <w:abstractNumId w:val="3"/>
+  </w:num>
+  <w:num w:numId="3" w16cid:durableId="1143548073">
+    <w:abstractNumId w:val="1"/>
+  </w:num>
+  <w:num w:numId="4" w16cid:durableId="1952546234">
+    <w:abstractNumId w:val="0"/>
+  </w:num>
+</w:numbering>
 </file>
 
 <file path=word/styles.xml><?xml version="1.0" encoding="utf-8"?>
@@ -2292,7 +4826,7 @@
   <w:style w:type="paragraph" w:default="1" w:styleId="Standard">
     <w:name w:val="Normal"/>
     <w:qFormat/>
-    <w:rsid w:val="00173A71"/>
+    <w:rsid w:val="00336ADB"/>
     <w:pPr>
       <w:spacing w:after="0" w:line="264" w:lineRule="auto"/>
     </w:pPr>
@@ -2303,7 +4837,6 @@
   <w:style w:type="character" w:default="1" w:styleId="Absatz-Standardschriftart">
     <w:name w:val="Default Paragraph Font"/>
     <w:uiPriority w:val="1"/>
-    <w:semiHidden/>
     <w:unhideWhenUsed/>
   </w:style>
   <w:style w:type="table" w:default="1" w:styleId="NormaleTabelle">
@@ -2508,6 +5041,17 @@
       <w:color w:val="4BACC6" w:themeColor="accent5"/>
       <w:u w:val="single"/>
     </w:rPr>
+  </w:style>
+  <w:style w:type="paragraph" w:styleId="Listenabsatz">
+    <w:name w:val="List Paragraph"/>
+    <w:basedOn w:val="Standard"/>
+    <w:uiPriority w:val="34"/>
+    <w:qFormat/>
+    <w:rsid w:val="00F32EA9"/>
+    <w:pPr>
+      <w:ind w:left="720"/>
+      <w:contextualSpacing/>
+    </w:pPr>
   </w:style>
 </w:styles>
 </file>

</xml_diff>